<commit_message>
Lint gate + dead-code cleanup: ruff config, 45 findings resolved, CI enforces it
- ruff.toml with a practical rule set (E,F,W,B,I,UP,SIM,RET) and documented exceptions for
  the patterns this codebase deliberately uses (long narrative strings, constraint lambdas,
  sys.path bootstrap in CLI/scripts, FastAPI Form/File defaults)
- removed 9 dead variables and 19 unused imports, including ones that were quietly misleading:
  `real_term` in the MC summary, `missed`/`prev_pos` in the stop backtest, `contrib` in the
  crisis test, `network_tried` in the fetcher, an unused cluster `label` in correlation_clusters
- fixed raise-from in the API error path and a printf-style format call
- requirements-dev.txt; CI now runs `ruff check .` before the tests

Verified: `ruff check .` reports "All checks passed"; 96/96 tests pass; a live web analyze
job completes offline and the Overview interpretation lookups resolve against the payload.
</commit_message>
<xml_diff>
--- a/portfolio_model/outputs/web/report/portfolio_analysis_report.docx
+++ b/portfolio_model/outputs/web/report/portfolio_analysis_report.docx
@@ -16,7 +16,7 @@
           <w:b w:val="0"/>
           <w:i/>
         </w:rPr>
-        <w:t>Prepared for: Laura Gao Portfolio | Generated 2026-10-11 20:58 UTC | Seed 42 | 2,000 simulations | Model v1.0.0</w:t>
+        <w:t>Prepared for: Laura Gao Portfolio | Generated 2026-10-11 21:25 UTC | Seed 42 | 1,500 simulations | Model v1.0.0</w:t>
       </w:r>
     </w:p>
     <w:p>
@@ -26,6 +26,269 @@
           <w:i/>
         </w:rPr>
         <w:t>All forward-looking figures are model estimates, simulation results, scenarios, or assumptions — never guarantees.</w:t>
+      </w:r>
+    </w:p>
+    <w:p>
+      <w:pPr>
+        <w:pStyle w:val="Heading1"/>
+      </w:pPr>
+      <w:r>
+        <w:t>How to read this report</w:t>
+      </w:r>
+    </w:p>
+    <w:p>
+      <w:r>
+        <w:rPr>
+          <w:b w:val="0"/>
+          <w:i/>
+        </w:rPr>
+        <w:t>Read it as answers to six questions rather than front to back:</w:t>
+      </w:r>
+    </w:p>
+    <w:tbl>
+      <w:tblPr>
+        <w:tblStyle w:val="LightGrid-Accent1"/>
+        <w:tblW w:type="auto" w:w="0"/>
+        <w:tblLook w:firstColumn="1" w:firstRow="1" w:lastColumn="0" w:lastRow="0" w:noHBand="0" w:noVBand="1" w:val="04A0"/>
+      </w:tblPr>
+      <w:tblGrid>
+        <w:gridCol w:w="4320"/>
+        <w:gridCol w:w="4320"/>
+      </w:tblGrid>
+      <w:tr>
+        <w:tc>
+          <w:tcPr>
+            <w:tcW w:type="dxa" w:w="4320"/>
+          </w:tcPr>
+          <w:p>
+            <w:r>
+              <w:rPr>
+                <w:b/>
+                <w:sz w:val="16"/>
+              </w:rPr>
+              <w:t>question</w:t>
+            </w:r>
+          </w:p>
+        </w:tc>
+        <w:tc>
+          <w:tcPr>
+            <w:tcW w:type="dxa" w:w="4320"/>
+          </w:tcPr>
+          <w:p>
+            <w:r>
+              <w:rPr>
+                <w:b/>
+                <w:sz w:val="16"/>
+              </w:rPr>
+              <w:t>see</w:t>
+            </w:r>
+          </w:p>
+        </w:tc>
+      </w:tr>
+      <w:tr>
+        <w:tc>
+          <w:tcPr>
+            <w:tcW w:type="dxa" w:w="4320"/>
+          </w:tcPr>
+          <w:p>
+            <w:r>
+              <w:rPr>
+                <w:sz w:val="16"/>
+              </w:rPr>
+              <w:t>Can the 2033 obligation actually be funded?</w:t>
+            </w:r>
+          </w:p>
+        </w:tc>
+        <w:tc>
+          <w:tcPr>
+            <w:tcW w:type="dxa" w:w="4320"/>
+          </w:tcPr>
+          <w:p>
+            <w:r>
+              <w:rPr>
+                <w:sz w:val="16"/>
+              </w:rPr>
+              <w:t>Section 14 Model Comparison; Section 11 Risk</w:t>
+            </w:r>
+          </w:p>
+        </w:tc>
+      </w:tr>
+      <w:tr>
+        <w:tc>
+          <w:tcPr>
+            <w:tcW w:type="dxa" w:w="4320"/>
+          </w:tcPr>
+          <w:p>
+            <w:r>
+              <w:rPr>
+                <w:sz w:val="16"/>
+              </w:rPr>
+              <w:t>How bad can it get?</w:t>
+            </w:r>
+          </w:p>
+        </w:tc>
+        <w:tc>
+          <w:tcPr>
+            <w:tcW w:type="dxa" w:w="4320"/>
+          </w:tcPr>
+          <w:p>
+            <w:r>
+              <w:rPr>
+                <w:sz w:val="16"/>
+              </w:rPr>
+              <w:t>Section 7 Monte Carlo; Section 9 Historical Bootstrap</w:t>
+            </w:r>
+          </w:p>
+        </w:tc>
+      </w:tr>
+      <w:tr>
+        <w:tc>
+          <w:tcPr>
+            <w:tcW w:type="dxa" w:w="4320"/>
+          </w:tcPr>
+          <w:p>
+            <w:r>
+              <w:rPr>
+                <w:sz w:val="16"/>
+              </w:rPr>
+              <w:t>Is this actually diversified?</w:t>
+            </w:r>
+          </w:p>
+        </w:tc>
+        <w:tc>
+          <w:tcPr>
+            <w:tcW w:type="dxa" w:w="4320"/>
+          </w:tcPr>
+          <w:p>
+            <w:r>
+              <w:rPr>
+                <w:sz w:val="16"/>
+              </w:rPr>
+              <w:t>Section 2 Portfolio Overview; Section 11 Risk</w:t>
+            </w:r>
+          </w:p>
+        </w:tc>
+      </w:tr>
+      <w:tr>
+        <w:tc>
+          <w:tcPr>
+            <w:tcW w:type="dxa" w:w="4320"/>
+          </w:tcPr>
+          <w:p>
+            <w:r>
+              <w:rPr>
+                <w:sz w:val="16"/>
+              </w:rPr>
+              <w:t>Which decisions dominate the outcome?</w:t>
+            </w:r>
+          </w:p>
+        </w:tc>
+        <w:tc>
+          <w:tcPr>
+            <w:tcW w:type="dxa" w:w="4320"/>
+          </w:tcPr>
+          <w:p>
+            <w:r>
+              <w:rPr>
+                <w:sz w:val="16"/>
+              </w:rPr>
+              <w:t>Section 19.5 Rule-Based Flags</w:t>
+            </w:r>
+          </w:p>
+        </w:tc>
+      </w:tr>
+      <w:tr>
+        <w:tc>
+          <w:tcPr>
+            <w:tcW w:type="dxa" w:w="4320"/>
+          </w:tcPr>
+          <w:p>
+            <w:r>
+              <w:rPr>
+                <w:sz w:val="16"/>
+              </w:rPr>
+              <w:t>How much do my assumptions matter?</w:t>
+            </w:r>
+          </w:p>
+        </w:tc>
+        <w:tc>
+          <w:tcPr>
+            <w:tcW w:type="dxa" w:w="4320"/>
+          </w:tcPr>
+          <w:p>
+            <w:r>
+              <w:rPr>
+                <w:sz w:val="16"/>
+              </w:rPr>
+              <w:t>Section 15 Sensitivity</w:t>
+            </w:r>
+          </w:p>
+        </w:tc>
+      </w:tr>
+      <w:tr>
+        <w:tc>
+          <w:tcPr>
+            <w:tcW w:type="dxa" w:w="4320"/>
+          </w:tcPr>
+          <w:p>
+            <w:r>
+              <w:rPr>
+                <w:sz w:val="16"/>
+              </w:rPr>
+              <w:t>What would a real crisis do to this mix?</w:t>
+            </w:r>
+          </w:p>
+        </w:tc>
+        <w:tc>
+          <w:tcPr>
+            <w:tcW w:type="dxa" w:w="4320"/>
+          </w:tcPr>
+          <w:p>
+            <w:r>
+              <w:rPr>
+                <w:sz w:val="16"/>
+              </w:rPr>
+              <w:t>Section 16 Stress Tests</w:t>
+            </w:r>
+          </w:p>
+        </w:tc>
+      </w:tr>
+      <w:tr>
+        <w:tc>
+          <w:tcPr>
+            <w:tcW w:type="dxa" w:w="4320"/>
+          </w:tcPr>
+          <w:p>
+            <w:r>
+              <w:rPr>
+                <w:sz w:val="16"/>
+              </w:rPr>
+              <w:t>What does any given number mean?</w:t>
+            </w:r>
+          </w:p>
+        </w:tc>
+        <w:tc>
+          <w:tcPr>
+            <w:tcW w:type="dxa" w:w="4320"/>
+          </w:tcPr>
+          <w:p>
+            <w:r>
+              <w:rPr>
+                <w:sz w:val="16"/>
+              </w:rPr>
+              <w:t>Appendix A Metric Definitions</w:t>
+            </w:r>
+          </w:p>
+        </w:tc>
+      </w:tr>
+    </w:tbl>
+    <w:p>
+      <w:r>
+        <w:rPr>
+          <w:b w:val="0"/>
+          <w:i/>
+        </w:rPr>
+        <w:t>Every metric named in this report is defined in Appendix A, generated from the same source file as the workbook Definitions sheet and the web UI Definitions tab.</w:t>
       </w:r>
     </w:p>
     <w:p>
@@ -51,7 +314,7 @@
           <w:b w:val="0"/>
           <w:i w:val="0"/>
         </w:rPr>
-        <w:t>What is expected? Simulated median 2033 value: Monte Carlo $672,783, bootstrap $677,921, Markov $654,294 (from $450,000 invested 2027-2028). These are model estimates, not guarantees.</w:t>
+        <w:t>What is expected? Simulated median 2033 value: Monte Carlo $674,244, bootstrap $679,084, Markov $654,294 (from $450,000 invested 2027-2028). These are model estimates, not guarantees.</w:t>
       </w:r>
     </w:p>
     <w:p>
@@ -60,7 +323,7 @@
           <w:b w:val="0"/>
           <w:i w:val="0"/>
         </w:rPr>
-        <w:t>What could go wrong? 5th-percentile 2033 outcomes: MC $421,713, bootstrap $444,645. CVaR95 (bootstrap terminal): 10%.</w:t>
+        <w:t>What could go wrong? 5th-percentile 2033 outcomes: MC $421,535, bootstrap $452,196. CVaR95 (bootstrap terminal): 7%.</w:t>
       </w:r>
     </w:p>
     <w:p>
@@ -2128,7 +2391,7 @@
               <w:rPr>
                 <w:sz w:val="16"/>
               </w:rPr>
-              <w:t>15.2%</w:t>
+              <w:t>15.5%</w:t>
             </w:r>
           </w:p>
         </w:tc>
@@ -2156,7 +2419,7 @@
               <w:rPr>
                 <w:sz w:val="16"/>
               </w:rPr>
-              <w:t>1.2%</w:t>
+              <w:t>-0.5%</w:t>
             </w:r>
           </w:p>
         </w:tc>
@@ -2184,7 +2447,7 @@
               <w:rPr>
                 <w:sz w:val="16"/>
               </w:rPr>
-              <w:t>9.7%</w:t>
+              <w:t>7.5%</w:t>
             </w:r>
           </w:p>
         </w:tc>
@@ -2436,7 +2699,7 @@
               <w:rPr>
                 <w:sz w:val="16"/>
               </w:rPr>
-              <w:t>-9.4%</w:t>
+              <w:t>-9.2%</w:t>
             </w:r>
           </w:p>
         </w:tc>
@@ -2492,7 +2755,7 @@
               <w:rPr>
                 <w:sz w:val="16"/>
               </w:rPr>
-              <w:t>20.0%</w:t>
+              <w:t>19.1%</w:t>
             </w:r>
           </w:p>
         </w:tc>
@@ -2520,7 +2783,7 @@
               <w:rPr>
                 <w:sz w:val="16"/>
               </w:rPr>
-              <w:t>85.0%</w:t>
+              <w:t>84.2%</w:t>
             </w:r>
           </w:p>
         </w:tc>
@@ -2548,7 +2811,7 @@
               <w:rPr>
                 <w:sz w:val="16"/>
               </w:rPr>
-              <w:t>87.6%</w:t>
+              <w:t>88.2%</w:t>
             </w:r>
           </w:p>
         </w:tc>
@@ -2576,7 +2839,7 @@
               <w:rPr>
                 <w:sz w:val="16"/>
               </w:rPr>
-              <w:t>79.2%</w:t>
+              <w:t>78.4%</w:t>
             </w:r>
           </w:p>
         </w:tc>
@@ -2604,7 +2867,7 @@
               <w:rPr>
                 <w:sz w:val="16"/>
               </w:rPr>
-              <w:t>82.0%</w:t>
+              <w:t>82.5%</w:t>
             </w:r>
           </w:p>
         </w:tc>
@@ -2632,7 +2895,7 @@
               <w:rPr>
                 <w:sz w:val="16"/>
               </w:rPr>
-              <w:t>73.2%</w:t>
+              <w:t>73.1%</w:t>
             </w:r>
           </w:p>
         </w:tc>
@@ -2660,7 +2923,7 @@
               <w:rPr>
                 <w:sz w:val="16"/>
               </w:rPr>
-              <w:t>75.8%</w:t>
+              <w:t>76.2%</w:t>
             </w:r>
           </w:p>
         </w:tc>
@@ -2688,7 +2951,7 @@
               <w:rPr>
                 <w:sz w:val="16"/>
               </w:rPr>
-              <w:t>66.3%</w:t>
+              <w:t>66.1%</w:t>
             </w:r>
           </w:p>
         </w:tc>
@@ -2716,7 +2979,7 @@
               <w:rPr>
                 <w:sz w:val="16"/>
               </w:rPr>
-              <w:t>68.0%</w:t>
+              <w:t>68.3%</w:t>
             </w:r>
           </w:p>
         </w:tc>
@@ -2744,7 +3007,7 @@
               <w:rPr>
                 <w:sz w:val="16"/>
               </w:rPr>
-              <w:t>85.0%</w:t>
+              <w:t>84.2%</w:t>
             </w:r>
           </w:p>
         </w:tc>
@@ -2772,7 +3035,7 @@
               <w:rPr>
                 <w:sz w:val="16"/>
               </w:rPr>
-              <w:t>91.7%</w:t>
+              <w:t>91.6%</w:t>
             </w:r>
           </w:p>
         </w:tc>
@@ -2828,7 +3091,7 @@
               <w:rPr>
                 <w:sz w:val="16"/>
               </w:rPr>
-              <w:t>99.2%</w:t>
+              <w:t>99.1%</w:t>
             </w:r>
           </w:p>
         </w:tc>
@@ -2963,7 +3226,7 @@
           <w:b w:val="0"/>
           <w:i w:val="0"/>
         </w:rPr>
-        <w:t>Monte Carlo (gaussian, 2,000 sims, seed 42, monthly steps, correlated multivariate returns, glide path + 5pp bands + 0.10% transaction cost). Median 2033 value $672,783; P(terminal &gt; $450k) = 92.7%; P(all 10 reserve payments funded) = 84.3%; P(&gt;20% drawdown) = 27.7%. Required reserve $441,127; median facility contribution $231,656.</w:t>
+        <w:t>Monte Carlo (gaussian, 1,500 sims, seed 42, monthly steps, correlated multivariate returns, glide path + 5pp bands + 0.10% transaction cost). Median 2033 value $674,244; P(terminal &gt; $450k) = 92.4%; P(all 10 reserve payments funded) = 84.3%; P(&gt;20% drawdown) = 27.7%. Required reserve $441,127; median facility contribution $233,116.</w:t>
       </w:r>
     </w:p>
     <w:p>
@@ -3570,7 +3833,7 @@
           <w:b w:val="0"/>
           <w:i w:val="0"/>
         </w:rPr>
-        <w:t>Historical bootstrap (block bootstrap, 20-trading-day blocks of real 2000-2025 joint daily returns, 2,000 sims). Median 2033 value $677,921; P(terminal &gt; $450k) = 94.5%; P(all payments funded) = 17.5%; P(&gt;20% drawdown) = 20.0%. This engine answers: what if the portfolio lived through actual historical market sequences?</w:t>
+        <w:t>Historical bootstrap (block bootstrap, 20-trading-day blocks of real 2000-2025 joint daily returns, 1,500 sims). Median 2033 value $679,084; P(terminal &gt; $450k) = 95.3%; P(all payments funded) = 18.0%; P(&gt;20% drawdown) = 19.1%. This engine answers: what if the portfolio lived through actual historical market sequences?</w:t>
       </w:r>
     </w:p>
     <w:p>
@@ -3746,7 +4009,7 @@
               <w:rPr>
                 <w:sz w:val="16"/>
               </w:rPr>
-              <w:t>672,783</w:t>
+              <w:t>674,244</w:t>
             </w:r>
           </w:p>
         </w:tc>
@@ -3772,7 +4035,7 @@
               <w:rPr>
                 <w:sz w:val="16"/>
               </w:rPr>
-              <w:t>677,921</w:t>
+              <w:t>679,084</w:t>
             </w:r>
           </w:p>
         </w:tc>
@@ -3800,7 +4063,7 @@
               <w:rPr>
                 <w:sz w:val="16"/>
               </w:rPr>
-              <w:t>421,713</w:t>
+              <w:t>421,535</w:t>
             </w:r>
           </w:p>
         </w:tc>
@@ -3826,7 +4089,7 @@
               <w:rPr>
                 <w:sz w:val="16"/>
               </w:rPr>
-              <w:t>444,645</w:t>
+              <w:t>452,196</w:t>
             </w:r>
           </w:p>
         </w:tc>
@@ -3854,7 +4117,7 @@
               <w:rPr>
                 <w:sz w:val="16"/>
               </w:rPr>
-              <w:t>558,755</w:t>
+              <w:t>557,947</w:t>
             </w:r>
           </w:p>
         </w:tc>
@@ -3880,7 +4143,7 @@
               <w:rPr>
                 <w:sz w:val="16"/>
               </w:rPr>
-              <w:t>572,291</w:t>
+              <w:t>574,701</w:t>
             </w:r>
           </w:p>
         </w:tc>
@@ -3908,7 +4171,7 @@
               <w:rPr>
                 <w:sz w:val="16"/>
               </w:rPr>
-              <w:t>672,783</w:t>
+              <w:t>674,244</w:t>
             </w:r>
           </w:p>
         </w:tc>
@@ -3934,7 +4197,7 @@
               <w:rPr>
                 <w:sz w:val="16"/>
               </w:rPr>
-              <w:t>677,921</w:t>
+              <w:t>679,084</w:t>
             </w:r>
           </w:p>
         </w:tc>
@@ -3962,7 +4225,7 @@
               <w:rPr>
                 <w:sz w:val="16"/>
               </w:rPr>
-              <w:t>828,620</w:t>
+              <w:t>834,769</w:t>
             </w:r>
           </w:p>
         </w:tc>
@@ -3988,7 +4251,7 @@
               <w:rPr>
                 <w:sz w:val="16"/>
               </w:rPr>
-              <w:t>813,510</w:t>
+              <w:t>810,838</w:t>
             </w:r>
           </w:p>
         </w:tc>
@@ -4016,7 +4279,7 @@
               <w:rPr>
                 <w:sz w:val="16"/>
               </w:rPr>
-              <w:t>1,105,186</w:t>
+              <w:t>1,127,619</w:t>
             </w:r>
           </w:p>
         </w:tc>
@@ -4042,7 +4305,7 @@
               <w:rPr>
                 <w:sz w:val="16"/>
               </w:rPr>
-              <w:t>1,065,062</w:t>
+              <w:t>1,065,034</w:t>
             </w:r>
           </w:p>
         </w:tc>
@@ -4070,7 +4333,7 @@
               <w:rPr>
                 <w:sz w:val="16"/>
               </w:rPr>
-              <w:t>0.926</w:t>
+              <w:t>0.924</w:t>
             </w:r>
           </w:p>
         </w:tc>
@@ -4096,7 +4359,7 @@
               <w:rPr>
                 <w:sz w:val="16"/>
               </w:rPr>
-              <w:t>0.945</w:t>
+              <w:t>0.953</w:t>
             </w:r>
           </w:p>
         </w:tc>
@@ -4150,7 +4413,7 @@
               <w:rPr>
                 <w:sz w:val="16"/>
               </w:rPr>
-              <w:t>0.175</w:t>
+              <w:t>0.180</w:t>
             </w:r>
           </w:p>
         </w:tc>
@@ -4204,7 +4467,7 @@
               <w:rPr>
                 <w:sz w:val="16"/>
               </w:rPr>
-              <w:t>-0.151</w:t>
+              <w:t>-0.149</w:t>
             </w:r>
           </w:p>
         </w:tc>
@@ -4258,7 +4521,7 @@
               <w:rPr>
                 <w:sz w:val="16"/>
               </w:rPr>
-              <w:t>0.200</w:t>
+              <w:t>0.191</w:t>
             </w:r>
           </w:p>
         </w:tc>
@@ -4312,7 +4575,7 @@
               <w:rPr>
                 <w:sz w:val="16"/>
               </w:rPr>
-              <w:t>0.012</w:t>
+              <w:t>-0.005</w:t>
             </w:r>
           </w:p>
         </w:tc>
@@ -4340,7 +4603,7 @@
               <w:rPr>
                 <w:sz w:val="16"/>
               </w:rPr>
-              <w:t>0.152</w:t>
+              <w:t>0.155</w:t>
             </w:r>
           </w:p>
         </w:tc>
@@ -4366,7 +4629,7 @@
               <w:rPr>
                 <w:sz w:val="16"/>
               </w:rPr>
-              <w:t>0.097</w:t>
+              <w:t>0.075</w:t>
             </w:r>
           </w:p>
         </w:tc>
@@ -4394,7 +4657,7 @@
               <w:rPr>
                 <w:sz w:val="16"/>
               </w:rPr>
-              <w:t>0.207</w:t>
+              <w:t>0.209</w:t>
             </w:r>
           </w:p>
         </w:tc>
@@ -4420,7 +4683,7 @@
               <w:rPr>
                 <w:sz w:val="16"/>
               </w:rPr>
-              <w:t>0.155</w:t>
+              <w:t>0.116</w:t>
             </w:r>
           </w:p>
         </w:tc>
@@ -4448,7 +4711,7 @@
               <w:rPr>
                 <w:sz w:val="16"/>
               </w:rPr>
-              <w:t>0.273</w:t>
+              <w:t>0.285</w:t>
             </w:r>
           </w:p>
         </w:tc>
@@ -4474,7 +4737,7 @@
               <w:rPr>
                 <w:sz w:val="16"/>
               </w:rPr>
-              <w:t>0.213</w:t>
+              <w:t>0.192</w:t>
             </w:r>
           </w:p>
         </w:tc>
@@ -4503,7 +4766,7 @@
           <w:b w:val="0"/>
           <w:i w:val="0"/>
         </w:rPr>
-        <w:t>Base case success 91.2%. Minimum return shift for &gt;=90% success: -3%. Portfolio remains robust across the tested volatility range.</w:t>
+        <w:t>Base case success 91.8%. Minimum return shift for &gt;=90% success: -3%. Portfolio remains robust across the tested volatility range.</w:t>
       </w:r>
     </w:p>
     <w:p>
@@ -12638,7 +12901,7 @@
           <w:b w:val="0"/>
           <w:i w:val="0"/>
         </w:rPr>
-        <w:t>- Tail risk: bootstrap CVaR95 10% vs Gaussian MC 15% — real history has fatter tails than the parametric model.</w:t>
+        <w:t>- Tail risk: bootstrap CVaR95 7% vs Gaussian MC 15% — real history has fatter tails than the parametric model.</w:t>
       </w:r>
     </w:p>
     <w:p>
@@ -12647,7 +12910,7 @@
           <w:b w:val="0"/>
           <w:i w:val="0"/>
         </w:rPr>
-        <w:t>- Reserve funding risk: P(all 10 payments funded) = 84.3% (MC) / 17.5% (bootstrap).</w:t>
+        <w:t>- Reserve funding risk: P(all 10 payments funded) = 84.3% (MC) / 18.0% (bootstrap).</w:t>
       </w:r>
     </w:p>
     <w:p>
@@ -13089,7 +13352,7 @@
               <w:rPr>
                 <w:sz w:val="16"/>
               </w:rPr>
-              <w:t>0.175</w:t>
+              <w:t>0.180</w:t>
             </w:r>
           </w:p>
         </w:tc>
@@ -13483,7 +13746,7 @@
           <w:b w:val="0"/>
           <w:i w:val="0"/>
         </w:rPr>
-        <w:t>- Size the 2033 reserve using the bootstrap (heavier-tail) distribution, not the Gaussian MC: bootstrap P(funded) = 17.5%.</w:t>
+        <w:t>- Size the 2033 reserve using the bootstrap (heavier-tail) distribution, not the Gaussian MC: bootstrap P(funded) = 18.0%.</w:t>
       </w:r>
     </w:p>
     <w:p>
@@ -13509,7 +13772,7 @@
           <w:b w:val="0"/>
           <w:i w:val="0"/>
         </w:rPr>
-        <w:t>- Adopt 5pp rebalancing bands with 0.10% cost budget; simulated mean turnover $472,944 per path.</w:t>
+        <w:t>- Adopt 5pp rebalancing bands with 0.10% cost budget; simulated mean turnover $477,200 per path.</w:t>
       </w:r>
     </w:p>
     <w:p>
@@ -13748,7 +14011,7 @@
           <w:b w:val="0"/>
           <w:i w:val="0"/>
         </w:rPr>
-        <w:t>- Random seed 42; 2,000 simulations per engine.</w:t>
+        <w:t>- Random seed 42; 1,500 simulations per engine.</w:t>
       </w:r>
     </w:p>
     <w:p>
@@ -13844,7 +14107,7 @@
           <w:b w:val="0"/>
           <w:i w:val="0"/>
         </w:rPr>
-        <w:t>- Both engines show median 2033 value above invested contributions (MC $672,783, bootstrap $677,921).</w:t>
+        <w:t>- Both engines show median 2033 value above invested contributions (MC $674,244, bootstrap $679,084).</w:t>
       </w:r>
     </w:p>
     <w:p>
@@ -13879,7 +14142,7 @@
           <w:b w:val="0"/>
           <w:i w:val="0"/>
         </w:rPr>
-        <w:t>- Bootstrap downside: p5 2033 value $444,645; reserve funding probability 17.5%.</w:t>
+        <w:t>- Bootstrap downside: p5 2033 value $452,196; reserve funding probability 18.0%.</w:t>
       </w:r>
     </w:p>
     <w:p>
@@ -14067,6 +14330,3879 @@
         <w:t>- [ ] DUOL history length / data confidence</w:t>
       </w:r>
     </w:p>
+    <w:p>
+      <w:r>
+        <w:br w:type="page"/>
+      </w:r>
+    </w:p>
+    <w:p>
+      <w:pPr>
+        <w:pStyle w:val="Heading1"/>
+      </w:pPr>
+      <w:r>
+        <w:t>Appendix A. Metric Definitions</w:t>
+      </w:r>
+    </w:p>
+    <w:p>
+      <w:r>
+        <w:rPr>
+          <w:b w:val="0"/>
+          <w:i/>
+        </w:rPr>
+        <w:t>Generated from portfolio_model/src/metric_glossary.py — the same source as the workbook Definitions sheet and the web UI Definitions tab. The 'Trap' column is the way this metric is most often misread.</w:t>
+      </w:r>
+    </w:p>
+    <w:tbl>
+      <w:tblPr>
+        <w:tblStyle w:val="LightGrid-Accent1"/>
+        <w:tblW w:type="auto" w:w="0"/>
+        <w:tblLook w:firstColumn="1" w:firstRow="1" w:lastColumn="0" w:lastRow="0" w:noHBand="0" w:noVBand="1" w:val="04A0"/>
+      </w:tblPr>
+      <w:tblGrid>
+        <w:gridCol w:w="2160"/>
+        <w:gridCol w:w="2160"/>
+        <w:gridCol w:w="2160"/>
+        <w:gridCol w:w="2160"/>
+      </w:tblGrid>
+      <w:tr>
+        <w:tc>
+          <w:tcPr>
+            <w:tcW w:type="dxa" w:w="2160"/>
+          </w:tcPr>
+          <w:p>
+            <w:r>
+              <w:rPr>
+                <w:b/>
+                <w:sz w:val="16"/>
+              </w:rPr>
+              <w:t>metric</w:t>
+            </w:r>
+          </w:p>
+        </w:tc>
+        <w:tc>
+          <w:tcPr>
+            <w:tcW w:type="dxa" w:w="2160"/>
+          </w:tcPr>
+          <w:p>
+            <w:r>
+              <w:rPr>
+                <w:b/>
+                <w:sz w:val="16"/>
+              </w:rPr>
+              <w:t>what_it_is</w:t>
+            </w:r>
+          </w:p>
+        </w:tc>
+        <w:tc>
+          <w:tcPr>
+            <w:tcW w:type="dxa" w:w="2160"/>
+          </w:tcPr>
+          <w:p>
+            <w:r>
+              <w:rPr>
+                <w:b/>
+                <w:sz w:val="16"/>
+              </w:rPr>
+              <w:t>how_to_read_it</w:t>
+            </w:r>
+          </w:p>
+        </w:tc>
+        <w:tc>
+          <w:tcPr>
+            <w:tcW w:type="dxa" w:w="2160"/>
+          </w:tcPr>
+          <w:p>
+            <w:r>
+              <w:rPr>
+                <w:b/>
+                <w:sz w:val="16"/>
+              </w:rPr>
+              <w:t>trap</w:t>
+            </w:r>
+          </w:p>
+        </w:tc>
+      </w:tr>
+      <w:tr>
+        <w:tc>
+          <w:tcPr>
+            <w:tcW w:type="dxa" w:w="2160"/>
+          </w:tcPr>
+          <w:p>
+            <w:r>
+              <w:rPr>
+                <w:sz w:val="16"/>
+              </w:rPr>
+              <w:t>Weights source</w:t>
+            </w:r>
+          </w:p>
+        </w:tc>
+        <w:tc>
+          <w:tcPr>
+            <w:tcW w:type="dxa" w:w="2160"/>
+          </w:tcPr>
+          <w:p>
+            <w:r>
+              <w:rPr>
+                <w:sz w:val="16"/>
+              </w:rPr>
+              <w:t>Which input column was used: explicit portfolio weights, market value / total, or quantity x price.</w:t>
+            </w:r>
+          </w:p>
+        </w:tc>
+        <w:tc>
+          <w:tcPr>
+            <w:tcW w:type="dxa" w:w="2160"/>
+          </w:tcPr>
+          <w:p>
+            <w:r>
+              <w:rPr>
+                <w:sz w:val="16"/>
+              </w:rPr>
+              <w:t>If it says 'supplied weights', the analysis is about the allocation you wrote down. If it says 'derived from market value', it reflects your actual positions today.</w:t>
+            </w:r>
+          </w:p>
+        </w:tc>
+        <w:tc>
+          <w:tcPr>
+            <w:tcW w:type="dxa" w:w="2160"/>
+          </w:tcPr>
+          <w:p>
+            <w:r>
+              <w:rPr>
+                <w:sz w:val="16"/>
+              </w:rPr>
+              <w:t>Weights are renormalised to 100%. If your weights summed to 92%, everything is scaled up by 8.7% silently.</w:t>
+            </w:r>
+          </w:p>
+        </w:tc>
+      </w:tr>
+      <w:tr>
+        <w:tc>
+          <w:tcPr>
+            <w:tcW w:type="dxa" w:w="2160"/>
+          </w:tcPr>
+          <w:p>
+            <w:r>
+              <w:rPr>
+                <w:sz w:val="16"/>
+              </w:rPr>
+              <w:t>Expected return (annual)</w:t>
+            </w:r>
+          </w:p>
+        </w:tc>
+        <w:tc>
+          <w:tcPr>
+            <w:tcW w:type="dxa" w:w="2160"/>
+          </w:tcPr>
+          <w:p>
+            <w:r>
+              <w:rPr>
+                <w:sz w:val="16"/>
+              </w:rPr>
+              <w:t>Spreadsheet 'Expected Return' column when present and expected_returns.source = input; otherwise the historical mean compounded to a year, shrunk toward the cross-asset mean by expected_returns.shrinkage.</w:t>
+            </w:r>
+          </w:p>
+        </w:tc>
+        <w:tc>
+          <w:tcPr>
+            <w:tcW w:type="dxa" w:w="2160"/>
+          </w:tcPr>
+          <w:p>
+            <w:r>
+              <w:rPr>
+                <w:sz w:val="16"/>
+              </w:rPr>
+              <w:t>This is the single most influential number in the whole report. A 1pp change moves the median 2033 outcome by roughly the horizon length in years.</w:t>
+            </w:r>
+          </w:p>
+        </w:tc>
+        <w:tc>
+          <w:tcPr>
+            <w:tcW w:type="dxa" w:w="2160"/>
+          </w:tcPr>
+          <w:p>
+            <w:r>
+              <w:rPr>
+                <w:sz w:val="16"/>
+              </w:rPr>
+              <w:t>It is an assumption, not a forecast. The engines are not predicting; they are answering 'what follows from these assumptions'.</w:t>
+            </w:r>
+          </w:p>
+        </w:tc>
+      </w:tr>
+      <w:tr>
+        <w:tc>
+          <w:tcPr>
+            <w:tcW w:type="dxa" w:w="2160"/>
+          </w:tcPr>
+          <w:p>
+            <w:r>
+              <w:rPr>
+                <w:sz w:val="16"/>
+              </w:rPr>
+              <w:t>Volatility (annual)</w:t>
+            </w:r>
+          </w:p>
+        </w:tc>
+        <w:tc>
+          <w:tcPr>
+            <w:tcW w:type="dxa" w:w="2160"/>
+          </w:tcPr>
+          <w:p>
+            <w:r>
+              <w:rPr>
+                <w:sz w:val="16"/>
+              </w:rPr>
+              <w:t>Standard deviation of monthly returns x sqrt(12).</w:t>
+            </w:r>
+          </w:p>
+        </w:tc>
+        <w:tc>
+          <w:tcPr>
+            <w:tcW w:type="dxa" w:w="2160"/>
+          </w:tcPr>
+          <w:p>
+            <w:r>
+              <w:rPr>
+                <w:sz w:val="16"/>
+              </w:rPr>
+              <w:t>20% annual volatility means roughly two-thirds of months land within +/-5.8% of the average month. It measures dispersion, not the chance of losing money.</w:t>
+            </w:r>
+          </w:p>
+        </w:tc>
+        <w:tc>
+          <w:tcPr>
+            <w:tcW w:type="dxa" w:w="2160"/>
+          </w:tcPr>
+          <w:p>
+            <w:r>
+              <w:rPr>
+                <w:sz w:val="16"/>
+              </w:rPr>
+              <w:t>Volatility from a short history (see confidence) is unreliable, and it treats upside and downside moves identically.</w:t>
+            </w:r>
+          </w:p>
+        </w:tc>
+      </w:tr>
+      <w:tr>
+        <w:tc>
+          <w:tcPr>
+            <w:tcW w:type="dxa" w:w="2160"/>
+          </w:tcPr>
+          <w:p>
+            <w:r>
+              <w:rPr>
+                <w:sz w:val="16"/>
+              </w:rPr>
+              <w:t>Risk-free rate</w:t>
+            </w:r>
+          </w:p>
+        </w:tc>
+        <w:tc>
+          <w:tcPr>
+            <w:tcW w:type="dxa" w:w="2160"/>
+          </w:tcPr>
+          <w:p>
+            <w:r>
+              <w:rPr>
+                <w:sz w:val="16"/>
+              </w:rPr>
+              <w:t>Config risk.risk_free_rate; also used as the return earned by the CASH holding every period.</w:t>
+            </w:r>
+          </w:p>
+        </w:tc>
+        <w:tc>
+          <w:tcPr>
+            <w:tcW w:type="dxa" w:w="2160"/>
+          </w:tcPr>
+          <w:p>
+            <w:r>
+              <w:rPr>
+                <w:sz w:val="16"/>
+              </w:rPr>
+              <w:t>Cash is never modelled as 0% return; it earns this rate. Raising it raises cash-heavy portfolios.</w:t>
+            </w:r>
+          </w:p>
+        </w:tc>
+        <w:tc>
+          <w:tcPr>
+            <w:tcW w:type="dxa" w:w="2160"/>
+          </w:tcPr>
+          <w:p>
+            <w:r>
+              <w:rPr>
+                <w:sz w:val="16"/>
+              </w:rPr>
+              <w:t>Sharpe here divides raw return by volatility (no risk-free subtraction), so it is a risk-adjusted *ratio*, not the textbook excess-return Sharpe.</w:t>
+            </w:r>
+          </w:p>
+        </w:tc>
+      </w:tr>
+      <w:tr>
+        <w:tc>
+          <w:tcPr>
+            <w:tcW w:type="dxa" w:w="2160"/>
+          </w:tcPr>
+          <w:p>
+            <w:r>
+              <w:rPr>
+                <w:sz w:val="16"/>
+              </w:rPr>
+              <w:t>Inflation assumption</w:t>
+            </w:r>
+          </w:p>
+        </w:tc>
+        <w:tc>
+          <w:tcPr>
+            <w:tcW w:type="dxa" w:w="2160"/>
+          </w:tcPr>
+          <w:p>
+            <w:r>
+              <w:rPr>
+                <w:sz w:val="16"/>
+              </w:rPr>
+              <w:t>Config risk.inflation_base, applied to convert nominal capital into 'real capital' for floor tests.</w:t>
+            </w:r>
+          </w:p>
+        </w:tc>
+        <w:tc>
+          <w:tcPr>
+            <w:tcW w:type="dxa" w:w="2160"/>
+          </w:tcPr>
+          <w:p>
+            <w:r>
+              <w:rPr>
+                <w:sz w:val="16"/>
+              </w:rPr>
+              <w:t>Real success is always lower than nominal success. The gap between the two is the cost of ignoring inflation.</w:t>
+            </w:r>
+          </w:p>
+        </w:tc>
+        <w:tc>
+          <w:tcPr>
+            <w:tcW w:type="dxa" w:w="2160"/>
+          </w:tcPr>
+          <w:p>
+            <w:r>
+              <w:rPr>
+                <w:sz w:val="16"/>
+              </w:rPr>
+              <w:t>Returns are nominal; only the success thresholds are inflation-adjusted. The model does not deflate the return series.</w:t>
+            </w:r>
+          </w:p>
+        </w:tc>
+      </w:tr>
+      <w:tr>
+        <w:tc>
+          <w:tcPr>
+            <w:tcW w:type="dxa" w:w="2160"/>
+          </w:tcPr>
+          <w:p>
+            <w:r>
+              <w:rPr>
+                <w:sz w:val="16"/>
+              </w:rPr>
+              <w:t>Historical CAGR</w:t>
+            </w:r>
+          </w:p>
+        </w:tc>
+        <w:tc>
+          <w:tcPr>
+            <w:tcW w:type="dxa" w:w="2160"/>
+          </w:tcPr>
+          <w:p>
+            <w:r>
+              <w:rPr>
+                <w:sz w:val="16"/>
+              </w:rPr>
+              <w:t>(final index value / first index value)^(1 / years) - 1, on the rebalanced current-weight index.</w:t>
+            </w:r>
+          </w:p>
+        </w:tc>
+        <w:tc>
+          <w:tcPr>
+            <w:tcW w:type="dxa" w:w="2160"/>
+          </w:tcPr>
+          <w:p>
+            <w:r>
+              <w:rPr>
+                <w:sz w:val="16"/>
+              </w:rPr>
+              <w:t>A smoothed average of what this allocation actually did. Compare it with the simulated median to see whether your assumptions are optimistic or conservative.</w:t>
+            </w:r>
+          </w:p>
+        </w:tc>
+        <w:tc>
+          <w:tcPr>
+            <w:tcW w:type="dxa" w:w="2160"/>
+          </w:tcPr>
+          <w:p>
+            <w:r>
+              <w:rPr>
+                <w:sz w:val="16"/>
+              </w:rPr>
+              <w:t>It is path-dependent and start-date dependent. It also assumes today's weights had been held the whole time (rebalanced index), which is a hypothetical, not your real account.</w:t>
+            </w:r>
+          </w:p>
+        </w:tc>
+      </w:tr>
+      <w:tr>
+        <w:tc>
+          <w:tcPr>
+            <w:tcW w:type="dxa" w:w="2160"/>
+          </w:tcPr>
+          <w:p>
+            <w:r>
+              <w:rPr>
+                <w:sz w:val="16"/>
+              </w:rPr>
+              <w:t>Mean annual return (historical)</w:t>
+            </w:r>
+          </w:p>
+        </w:tc>
+        <w:tc>
+          <w:tcPr>
+            <w:tcW w:type="dxa" w:w="2160"/>
+          </w:tcPr>
+          <w:p>
+            <w:r>
+              <w:rPr>
+                <w:sz w:val="16"/>
+              </w:rPr>
+              <w:t>(1 + average monthly return)^12 - 1.</w:t>
+            </w:r>
+          </w:p>
+        </w:tc>
+        <w:tc>
+          <w:tcPr>
+            <w:tcW w:type="dxa" w:w="2160"/>
+          </w:tcPr>
+          <w:p>
+            <w:r>
+              <w:rPr>
+                <w:sz w:val="16"/>
+              </w:rPr>
+              <w:t>Higher than CAGR whenever returns were volatile, because volatility drags compounding down.</w:t>
+            </w:r>
+          </w:p>
+        </w:tc>
+        <w:tc>
+          <w:tcPr>
+            <w:tcW w:type="dxa" w:w="2160"/>
+          </w:tcPr>
+          <w:p>
+            <w:r>
+              <w:rPr>
+                <w:sz w:val="16"/>
+              </w:rPr>
+              <w:t>Mean annual return minus CAGR is roughly the volatility drag: never quote the mean as if it were achievable growth.</w:t>
+            </w:r>
+          </w:p>
+        </w:tc>
+      </w:tr>
+      <w:tr>
+        <w:tc>
+          <w:tcPr>
+            <w:tcW w:type="dxa" w:w="2160"/>
+          </w:tcPr>
+          <w:p>
+            <w:r>
+              <w:rPr>
+                <w:sz w:val="16"/>
+              </w:rPr>
+              <w:t>Volatility (historical, annual)</w:t>
+            </w:r>
+          </w:p>
+        </w:tc>
+        <w:tc>
+          <w:tcPr>
+            <w:tcW w:type="dxa" w:w="2160"/>
+          </w:tcPr>
+          <w:p>
+            <w:r>
+              <w:rPr>
+                <w:sz w:val="16"/>
+              </w:rPr>
+              <w:t>Standard deviation of portfolio monthly returns x sqrt(12).</w:t>
+            </w:r>
+          </w:p>
+        </w:tc>
+        <w:tc>
+          <w:tcPr>
+            <w:tcW w:type="dxa" w:w="2160"/>
+          </w:tcPr>
+          <w:p>
+            <w:r>
+              <w:rPr>
+                <w:sz w:val="16"/>
+              </w:rPr>
+              <w:t>Roughly 1 in 6 months lands outside +/-1 annual-volatility/3.6 of the average month.</w:t>
+            </w:r>
+          </w:p>
+        </w:tc>
+        <w:tc>
+          <w:tcPr>
+            <w:tcW w:type="dxa" w:w="2160"/>
+          </w:tcPr>
+          <w:p>
+            <w:r>
+              <w:rPr>
+                <w:sz w:val="16"/>
+              </w:rPr>
+              <w:t>Portfolio volatility is not the weighted average of holding volatilities; correlation is what makes it lower.</w:t>
+            </w:r>
+          </w:p>
+        </w:tc>
+      </w:tr>
+      <w:tr>
+        <w:tc>
+          <w:tcPr>
+            <w:tcW w:type="dxa" w:w="2160"/>
+          </w:tcPr>
+          <w:p>
+            <w:r>
+              <w:rPr>
+                <w:sz w:val="16"/>
+              </w:rPr>
+              <w:t>Sharpe (historical)</w:t>
+            </w:r>
+          </w:p>
+        </w:tc>
+        <w:tc>
+          <w:tcPr>
+            <w:tcW w:type="dxa" w:w="2160"/>
+          </w:tcPr>
+          <w:p>
+            <w:r>
+              <w:rPr>
+                <w:sz w:val="16"/>
+              </w:rPr>
+              <w:t>Mean annual return / annual volatility.</w:t>
+            </w:r>
+          </w:p>
+        </w:tc>
+        <w:tc>
+          <w:tcPr>
+            <w:tcW w:type="dxa" w:w="2160"/>
+          </w:tcPr>
+          <w:p>
+            <w:r>
+              <w:rPr>
+                <w:sz w:val="16"/>
+              </w:rPr>
+              <w:t>Above ~0.6 for a stock/bond portfolio is respectable; below ~0.25 means the extra return is not paying for the volatility.</w:t>
+            </w:r>
+          </w:p>
+        </w:tc>
+        <w:tc>
+          <w:tcPr>
+            <w:tcW w:type="dxa" w:w="2160"/>
+          </w:tcPr>
+          <w:p>
+            <w:r>
+              <w:rPr>
+                <w:sz w:val="16"/>
+              </w:rPr>
+              <w:t>No risk-free subtraction here, and it is computed on history. Two portfolios with the same Sharpe can have completely different drawdown shapes.</w:t>
+            </w:r>
+          </w:p>
+        </w:tc>
+      </w:tr>
+      <w:tr>
+        <w:tc>
+          <w:tcPr>
+            <w:tcW w:type="dxa" w:w="2160"/>
+          </w:tcPr>
+          <w:p>
+            <w:r>
+              <w:rPr>
+                <w:sz w:val="16"/>
+              </w:rPr>
+              <w:t>Sortino (historical)</w:t>
+            </w:r>
+          </w:p>
+        </w:tc>
+        <w:tc>
+          <w:tcPr>
+            <w:tcW w:type="dxa" w:w="2160"/>
+          </w:tcPr>
+          <w:p>
+            <w:r>
+              <w:rPr>
+                <w:sz w:val="16"/>
+              </w:rPr>
+              <w:t>Mean annual return / downside deviation (std of negative months only, x sqrt(12)).</w:t>
+            </w:r>
+          </w:p>
+        </w:tc>
+        <w:tc>
+          <w:tcPr>
+            <w:tcW w:type="dxa" w:w="2160"/>
+          </w:tcPr>
+          <w:p>
+            <w:r>
+              <w:rPr>
+                <w:sz w:val="16"/>
+              </w:rPr>
+              <w:t>Sortino &gt; Sharpe whenever upside is large. A big gap means the volatility is mostly good news.</w:t>
+            </w:r>
+          </w:p>
+        </w:tc>
+        <w:tc>
+          <w:tcPr>
+            <w:tcW w:type="dxa" w:w="2160"/>
+          </w:tcPr>
+          <w:p>
+            <w:r>
+              <w:rPr>
+                <w:sz w:val="16"/>
+              </w:rPr>
+              <w:t>With few negative months the downside deviation is noisy and Sortino looks flattering.</w:t>
+            </w:r>
+          </w:p>
+        </w:tc>
+      </w:tr>
+      <w:tr>
+        <w:tc>
+          <w:tcPr>
+            <w:tcW w:type="dxa" w:w="2160"/>
+          </w:tcPr>
+          <w:p>
+            <w:r>
+              <w:rPr>
+                <w:sz w:val="16"/>
+              </w:rPr>
+              <w:t>Downside deviation</w:t>
+            </w:r>
+          </w:p>
+        </w:tc>
+        <w:tc>
+          <w:tcPr>
+            <w:tcW w:type="dxa" w:w="2160"/>
+          </w:tcPr>
+          <w:p>
+            <w:r>
+              <w:rPr>
+                <w:sz w:val="16"/>
+              </w:rPr>
+              <w:t>Standard deviation of negative monthly returns x sqrt(12).</w:t>
+            </w:r>
+          </w:p>
+        </w:tc>
+        <w:tc>
+          <w:tcPr>
+            <w:tcW w:type="dxa" w:w="2160"/>
+          </w:tcPr>
+          <w:p>
+            <w:r>
+              <w:rPr>
+                <w:sz w:val="16"/>
+              </w:rPr>
+              <w:t>This is the number that maps to how the portfolio actually feels to hold.</w:t>
+            </w:r>
+          </w:p>
+        </w:tc>
+        <w:tc>
+          <w:tcPr>
+            <w:tcW w:type="dxa" w:w="2160"/>
+          </w:tcPr>
+          <w:p>
+            <w:r>
+              <w:rPr>
+                <w:sz w:val="16"/>
+              </w:rPr>
+              <w:t>Counts only months below zero, so it ignores how *often* you lose.</w:t>
+            </w:r>
+          </w:p>
+        </w:tc>
+      </w:tr>
+      <w:tr>
+        <w:tc>
+          <w:tcPr>
+            <w:tcW w:type="dxa" w:w="2160"/>
+          </w:tcPr>
+          <w:p>
+            <w:r>
+              <w:rPr>
+                <w:sz w:val="16"/>
+              </w:rPr>
+              <w:t>Max drawdown (historical)</w:t>
+            </w:r>
+          </w:p>
+        </w:tc>
+        <w:tc>
+          <w:tcPr>
+            <w:tcW w:type="dxa" w:w="2160"/>
+          </w:tcPr>
+          <w:p>
+            <w:r>
+              <w:rPr>
+                <w:sz w:val="16"/>
+              </w:rPr>
+              <w:t>Minimum of (value / running peak - 1) on the rebalanced index.</w:t>
+            </w:r>
+          </w:p>
+        </w:tc>
+        <w:tc>
+          <w:tcPr>
+            <w:tcW w:type="dxa" w:w="2160"/>
+          </w:tcPr>
+          <w:p>
+            <w:r>
+              <w:rPr>
+                <w:sz w:val="16"/>
+              </w:rPr>
+              <w:t>The realistic test of whether you could have held. -35% is survivable for a long horizon; -60% usually is not.</w:t>
+            </w:r>
+          </w:p>
+        </w:tc>
+        <w:tc>
+          <w:tcPr>
+            <w:tcW w:type="dxa" w:w="2160"/>
+          </w:tcPr>
+          <w:p>
+            <w:r>
+              <w:rPr>
+                <w:sz w:val="16"/>
+              </w:rPr>
+              <w:t>One event defines it. It says nothing about how long the recovery took (see the recovery table) and nothing about drawdowns that started after the trough.</w:t>
+            </w:r>
+          </w:p>
+        </w:tc>
+      </w:tr>
+      <w:tr>
+        <w:tc>
+          <w:tcPr>
+            <w:tcW w:type="dxa" w:w="2160"/>
+          </w:tcPr>
+          <w:p>
+            <w:r>
+              <w:rPr>
+                <w:sz w:val="16"/>
+              </w:rPr>
+              <w:t>Drawdown peak / trough / recovery dates</w:t>
+            </w:r>
+          </w:p>
+        </w:tc>
+        <w:tc>
+          <w:tcPr>
+            <w:tcW w:type="dxa" w:w="2160"/>
+          </w:tcPr>
+          <w:p>
+            <w:r>
+              <w:rPr>
+                <w:sz w:val="16"/>
+              </w:rPr>
+              <w:t>Date of the running peak before the worst trough, the trough date, and the first date the index exceeded the peak again.</w:t>
+            </w:r>
+          </w:p>
+        </w:tc>
+        <w:tc>
+          <w:tcPr>
+            <w:tcW w:type="dxa" w:w="2160"/>
+          </w:tcPr>
+          <w:p>
+            <w:r>
+              <w:rPr>
+                <w:sz w:val="16"/>
+              </w:rPr>
+              <w:t>Depth plus time-underwater is the real pain. A -30% drawdown recovered in 6 months is a different risk from one that took 4 years.</w:t>
+            </w:r>
+          </w:p>
+        </w:tc>
+        <w:tc>
+          <w:tcPr>
+            <w:tcW w:type="dxa" w:w="2160"/>
+          </w:tcPr>
+          <w:p>
+            <w:r>
+              <w:rPr>
+                <w:sz w:val="16"/>
+              </w:rPr>
+              <w:t>A blank recovery means the index had not recovered by the end of the data - not that it never will.</w:t>
+            </w:r>
+          </w:p>
+        </w:tc>
+      </w:tr>
+      <w:tr>
+        <w:tc>
+          <w:tcPr>
+            <w:tcW w:type="dxa" w:w="2160"/>
+          </w:tcPr>
+          <w:p>
+            <w:r>
+              <w:rPr>
+                <w:sz w:val="16"/>
+              </w:rPr>
+              <w:t>Days to recover (drawdown events)</w:t>
+            </w:r>
+          </w:p>
+        </w:tc>
+        <w:tc>
+          <w:tcPr>
+            <w:tcW w:type="dxa" w:w="2160"/>
+          </w:tcPr>
+          <w:p>
+            <w:r>
+              <w:rPr>
+                <w:sz w:val="16"/>
+              </w:rPr>
+              <w:t>Calendar days from each trough (deeper than -5%) back to zero drawdown.</w:t>
+            </w:r>
+          </w:p>
+        </w:tc>
+        <w:tc>
+          <w:tcPr>
+            <w:tcW w:type="dxa" w:w="2160"/>
+          </w:tcPr>
+          <w:p>
+            <w:r>
+              <w:rPr>
+                <w:sz w:val="16"/>
+              </w:rPr>
+              <w:t>Long recoveries are the argument for the glide path into 2033.</w:t>
+            </w:r>
+          </w:p>
+        </w:tc>
+        <w:tc>
+          <w:tcPr>
+            <w:tcW w:type="dxa" w:w="2160"/>
+          </w:tcPr>
+          <w:p>
+            <w:r>
+              <w:rPr>
+                <w:sz w:val="16"/>
+              </w:rPr>
+              <w:t>Events shallower than -5% are not listed, so the table understates small-but-frequent pain.</w:t>
+            </w:r>
+          </w:p>
+        </w:tc>
+      </w:tr>
+      <w:tr>
+        <w:tc>
+          <w:tcPr>
+            <w:tcW w:type="dxa" w:w="2160"/>
+          </w:tcPr>
+          <w:p>
+            <w:r>
+              <w:rPr>
+                <w:sz w:val="16"/>
+              </w:rPr>
+              <w:t>Correlation (pairwise, monthly)</w:t>
+            </w:r>
+          </w:p>
+        </w:tc>
+        <w:tc>
+          <w:tcPr>
+            <w:tcW w:type="dxa" w:w="2160"/>
+          </w:tcPr>
+          <w:p>
+            <w:r>
+              <w:rPr>
+                <w:sz w:val="16"/>
+              </w:rPr>
+              <w:t>Pearson correlation of monthly returns between two holdings over the full history.</w:t>
+            </w:r>
+          </w:p>
+        </w:tc>
+        <w:tc>
+          <w:tcPr>
+            <w:tcW w:type="dxa" w:w="2160"/>
+          </w:tcPr>
+          <w:p>
+            <w:r>
+              <w:rPr>
+                <w:sz w:val="16"/>
+              </w:rPr>
+              <w:t>+0.9 means they are effectively the same position split in two. Below +0.4 they genuinely diversify. Negative correlation is a hedge.</w:t>
+            </w:r>
+          </w:p>
+        </w:tc>
+        <w:tc>
+          <w:tcPr>
+            <w:tcW w:type="dxa" w:w="2160"/>
+          </w:tcPr>
+          <w:p>
+            <w:r>
+              <w:rPr>
+                <w:sz w:val="16"/>
+              </w:rPr>
+              <w:t>Correlation is estimated on history and rises toward 1.0 exactly when you need it not to.</w:t>
+            </w:r>
+          </w:p>
+        </w:tc>
+      </w:tr>
+      <w:tr>
+        <w:tc>
+          <w:tcPr>
+            <w:tcW w:type="dxa" w:w="2160"/>
+          </w:tcPr>
+          <w:p>
+            <w:r>
+              <w:rPr>
+                <w:sz w:val="16"/>
+              </w:rPr>
+              <w:t>Correlation cluster</w:t>
+            </w:r>
+          </w:p>
+        </w:tc>
+        <w:tc>
+          <w:tcPr>
+            <w:tcW w:type="dxa" w:w="2160"/>
+          </w:tcPr>
+          <w:p>
+            <w:r>
+              <w:rPr>
+                <w:sz w:val="16"/>
+              </w:rPr>
+              <w:t>Single-linkage grouping of holdings joined by correlation above the threshold.</w:t>
+            </w:r>
+          </w:p>
+        </w:tc>
+        <w:tc>
+          <w:tcPr>
+            <w:tcW w:type="dxa" w:w="2160"/>
+          </w:tcPr>
+          <w:p>
+            <w:r>
+              <w:rPr>
+                <w:sz w:val="16"/>
+              </w:rPr>
+              <w:t>A cluster of four names at 20% each is a 80% single-bet portfolio wearing four labels.</w:t>
+            </w:r>
+          </w:p>
+        </w:tc>
+        <w:tc>
+          <w:tcPr>
+            <w:tcW w:type="dxa" w:w="2160"/>
+          </w:tcPr>
+          <w:p>
+            <w:r>
+              <w:rPr>
+                <w:sz w:val="16"/>
+              </w:rPr>
+              <w:t>Single-linkage can chain A-B and B-C into one cluster even when A-C correlation is modest.</w:t>
+            </w:r>
+          </w:p>
+        </w:tc>
+      </w:tr>
+      <w:tr>
+        <w:tc>
+          <w:tcPr>
+            <w:tcW w:type="dxa" w:w="2160"/>
+          </w:tcPr>
+          <w:p>
+            <w:r>
+              <w:rPr>
+                <w:sz w:val="16"/>
+              </w:rPr>
+              <w:t>HHI (concentration index)</w:t>
+            </w:r>
+          </w:p>
+        </w:tc>
+        <w:tc>
+          <w:tcPr>
+            <w:tcW w:type="dxa" w:w="2160"/>
+          </w:tcPr>
+          <w:p>
+            <w:r>
+              <w:rPr>
+                <w:sz w:val="16"/>
+              </w:rPr>
+              <w:t>Sum of squared weights. Normalised version: (HHI - 1/n) / (1 - 1/n).</w:t>
+            </w:r>
+          </w:p>
+        </w:tc>
+        <w:tc>
+          <w:tcPr>
+            <w:tcW w:type="dxa" w:w="2160"/>
+          </w:tcPr>
+          <w:p>
+            <w:r>
+              <w:rPr>
+                <w:sz w:val="16"/>
+              </w:rPr>
+              <w:t>Raw HHI 0.25 means the concentration of an equal-weighted 4-holding portfolio. Normalised HHI 0 = perfectly spread, 1 = all in one name.</w:t>
+            </w:r>
+          </w:p>
+        </w:tc>
+        <w:tc>
+          <w:tcPr>
+            <w:tcW w:type="dxa" w:w="2160"/>
+          </w:tcPr>
+          <w:p>
+            <w:r>
+              <w:rPr>
+                <w:sz w:val="16"/>
+              </w:rPr>
+              <w:t>HHI sees position size only. Two 25% positions in perfectly correlated names look the same as two independent names.</w:t>
+            </w:r>
+          </w:p>
+        </w:tc>
+      </w:tr>
+      <w:tr>
+        <w:tc>
+          <w:tcPr>
+            <w:tcW w:type="dxa" w:w="2160"/>
+          </w:tcPr>
+          <w:p>
+            <w:r>
+              <w:rPr>
+                <w:sz w:val="16"/>
+              </w:rPr>
+              <w:t>Effective number of independent bets</w:t>
+            </w:r>
+          </w:p>
+        </w:tc>
+        <w:tc>
+          <w:tcPr>
+            <w:tcW w:type="dxa" w:w="2160"/>
+          </w:tcPr>
+          <w:p>
+            <w:r>
+              <w:rPr>
+                <w:sz w:val="16"/>
+              </w:rPr>
+              <w:t>1 / HHI, where HHI is the sum of squared weights over all holdings with weight &gt; 0.</w:t>
+            </w:r>
+          </w:p>
+        </w:tc>
+        <w:tc>
+          <w:tcPr>
+            <w:tcW w:type="dxa" w:w="2160"/>
+          </w:tcPr>
+          <w:p>
+            <w:r>
+              <w:rPr>
+                <w:sz w:val="16"/>
+              </w:rPr>
+              <w:t>7 holdings with effective_n 3.4 is a three-bet portfolio. This is the most honest diversification number in the report.</w:t>
+            </w:r>
+          </w:p>
+        </w:tc>
+        <w:tc>
+          <w:tcPr>
+            <w:tcW w:type="dxa" w:w="2160"/>
+          </w:tcPr>
+          <w:p>
+            <w:r>
+              <w:rPr>
+                <w:sz w:val="16"/>
+              </w:rPr>
+              <w:t>It measures weight concentration, not correlation-adjusted independence, so it is an upper bound on real diversification.</w:t>
+            </w:r>
+          </w:p>
+        </w:tc>
+      </w:tr>
+      <w:tr>
+        <w:tc>
+          <w:tcPr>
+            <w:tcW w:type="dxa" w:w="2160"/>
+          </w:tcPr>
+          <w:p>
+            <w:r>
+              <w:rPr>
+                <w:sz w:val="16"/>
+              </w:rPr>
+              <w:t>Top 3 / 5 / 10 weight</w:t>
+            </w:r>
+          </w:p>
+        </w:tc>
+        <w:tc>
+          <w:tcPr>
+            <w:tcW w:type="dxa" w:w="2160"/>
+          </w:tcPr>
+          <w:p>
+            <w:r>
+              <w:rPr>
+                <w:sz w:val="16"/>
+              </w:rPr>
+              <w:t>Sum of the largest three, five and ten weights.</w:t>
+            </w:r>
+          </w:p>
+        </w:tc>
+        <w:tc>
+          <w:tcPr>
+            <w:tcW w:type="dxa" w:w="2160"/>
+          </w:tcPr>
+          <w:p>
+            <w:r>
+              <w:rPr>
+                <w:sz w:val="16"/>
+              </w:rPr>
+              <w:t>Top 3 above 60% means three decisions dominate the outcome, whatever the rest of the sheet says.</w:t>
+            </w:r>
+          </w:p>
+        </w:tc>
+        <w:tc>
+          <w:tcPr>
+            <w:tcW w:type="dxa" w:w="2160"/>
+          </w:tcPr>
+          <w:p>
+            <w:r>
+              <w:rPr>
+                <w:sz w:val="16"/>
+              </w:rPr>
+              <w:t>With fewer than 3 holdings the top-3 figure is simply 100%.</w:t>
+            </w:r>
+          </w:p>
+        </w:tc>
+      </w:tr>
+      <w:tr>
+        <w:tc>
+          <w:tcPr>
+            <w:tcW w:type="dxa" w:w="2160"/>
+          </w:tcPr>
+          <w:p>
+            <w:r>
+              <w:rPr>
+                <w:sz w:val="16"/>
+              </w:rPr>
+              <w:t>Invested capital / contributions</w:t>
+            </w:r>
+          </w:p>
+        </w:tc>
+        <w:tc>
+          <w:tcPr>
+            <w:tcW w:type="dxa" w:w="2160"/>
+          </w:tcPr>
+          <w:p>
+            <w:r>
+              <w:rPr>
+                <w:sz w:val="16"/>
+              </w:rPr>
+              <w:t>Sum of cashflows.contributions amounts (default 2027: $300,000, 2028: $150,000).</w:t>
+            </w:r>
+          </w:p>
+        </w:tc>
+        <w:tc>
+          <w:tcPr>
+            <w:tcW w:type="dxa" w:w="2160"/>
+          </w:tcPr>
+          <w:p>
+            <w:r>
+              <w:rPr>
+                <w:sz w:val="16"/>
+              </w:rPr>
+              <w:t>Every 'success' number is measured against this figure, so changing it changes all probabilities.</w:t>
+            </w:r>
+          </w:p>
+        </w:tc>
+        <w:tc>
+          <w:tcPr>
+            <w:tcW w:type="dxa" w:w="2160"/>
+          </w:tcPr>
+          <w:p>
+            <w:r>
+              <w:rPr>
+                <w:sz w:val="16"/>
+              </w:rPr>
+              <w:t>Contributions are invested at the current glide-path target weights at that month, not at today's holdings weights.</w:t>
+            </w:r>
+          </w:p>
+        </w:tc>
+      </w:tr>
+      <w:tr>
+        <w:tc>
+          <w:tcPr>
+            <w:tcW w:type="dxa" w:w="2160"/>
+          </w:tcPr>
+          <w:p>
+            <w:r>
+              <w:rPr>
+                <w:sz w:val="16"/>
+              </w:rPr>
+              <w:t>Required reserve (present value)</w:t>
+            </w:r>
+          </w:p>
+        </w:tc>
+        <w:tc>
+          <w:tcPr>
+            <w:tcW w:type="dxa" w:w="2160"/>
+          </w:tcPr>
+          <w:p>
+            <w:r>
+              <w:rPr>
+                <w:sz w:val="16"/>
+              </w:rPr>
+              <w:t>Payment x [1 - (1+r)^-n] / r x (1+r) for n = last_year - first_year + 1 payments at rate = reserve_discount_rate (annuity-due).</w:t>
+            </w:r>
+          </w:p>
+        </w:tc>
+        <w:tc>
+          <w:tcPr>
+            <w:tcW w:type="dxa" w:w="2160"/>
+          </w:tcPr>
+          <w:p>
+            <w:r>
+              <w:rPr>
+                <w:sz w:val="16"/>
+              </w:rPr>
+              <w:t>This is the hard obligation the 2033 split must cover. Everything above it is the facility contribution.</w:t>
+            </w:r>
+          </w:p>
+        </w:tc>
+        <w:tc>
+          <w:tcPr>
+            <w:tcW w:type="dxa" w:w="2160"/>
+          </w:tcPr>
+          <w:p>
+            <w:r>
+              <w:rPr>
+                <w:sz w:val="16"/>
+              </w:rPr>
+              <w:t>It is a present value, not cash you must hold. A reserve exactly equal to it only works if the reserve keeps earning that rate.</w:t>
+            </w:r>
+          </w:p>
+        </w:tc>
+      </w:tr>
+      <w:tr>
+        <w:tc>
+          <w:tcPr>
+            <w:tcW w:type="dxa" w:w="2160"/>
+          </w:tcPr>
+          <w:p>
+            <w:r>
+              <w:rPr>
+                <w:sz w:val="16"/>
+              </w:rPr>
+              <w:t>2033 split</w:t>
+            </w:r>
+          </w:p>
+        </w:tc>
+        <w:tc>
+          <w:tcPr>
+            <w:tcW w:type="dxa" w:w="2160"/>
+          </w:tcPr>
+          <w:p>
+            <w:r>
+              <w:rPr>
+                <w:sz w:val="16"/>
+              </w:rPr>
+              <w:t>At the start of the glide-end year: reserve = min(value, required_reserve); facility = value - required_reserve.</w:t>
+            </w:r>
+          </w:p>
+        </w:tc>
+        <w:tc>
+          <w:tcPr>
+            <w:tcW w:type="dxa" w:w="2160"/>
+          </w:tcPr>
+          <w:p>
+            <w:r>
+              <w:rPr>
+                <w:sz w:val="16"/>
+              </w:rPr>
+              <w:t>A negative facility means the portfolio cannot cover the reserve at 2033 - the core failure mode of the plan.</w:t>
+            </w:r>
+          </w:p>
+        </w:tc>
+        <w:tc>
+          <w:tcPr>
+            <w:tcW w:type="dxa" w:w="2160"/>
+          </w:tcPr>
+          <w:p>
+            <w:r>
+              <w:rPr>
+                <w:sz w:val="16"/>
+              </w:rPr>
+              <w:t>The split is a modelling convention (one clean cut), not a legal or tax event.</w:t>
+            </w:r>
+          </w:p>
+        </w:tc>
+      </w:tr>
+      <w:tr>
+        <w:tc>
+          <w:tcPr>
+            <w:tcW w:type="dxa" w:w="2160"/>
+          </w:tcPr>
+          <w:p>
+            <w:r>
+              <w:rPr>
+                <w:sz w:val="16"/>
+              </w:rPr>
+              <w:t>Facility contribution</w:t>
+            </w:r>
+          </w:p>
+        </w:tc>
+        <w:tc>
+          <w:tcPr>
+            <w:tcW w:type="dxa" w:w="2160"/>
+          </w:tcPr>
+          <w:p>
+            <w:r>
+              <w:rPr>
+                <w:sz w:val="16"/>
+              </w:rPr>
+              <w:t>Terminal value at 2033 minus required reserve, per simulation.</w:t>
+            </w:r>
+          </w:p>
+        </w:tc>
+        <w:tc>
+          <w:tcPr>
+            <w:tcW w:type="dxa" w:w="2160"/>
+          </w:tcPr>
+          <w:p>
+            <w:r>
+              <w:rPr>
+                <w:sz w:val="16"/>
+              </w:rPr>
+              <w:t>Its 5th percentile is the number to plan against; its median is the number to hope for.</w:t>
+            </w:r>
+          </w:p>
+        </w:tc>
+        <w:tc>
+          <w:tcPr>
+            <w:tcW w:type="dxa" w:w="2160"/>
+          </w:tcPr>
+          <w:p>
+            <w:r>
+              <w:rPr>
+                <w:sz w:val="16"/>
+              </w:rPr>
+              <w:t>Negative values are real outcomes, not errors - they are the shortfall cases.</w:t>
+            </w:r>
+          </w:p>
+        </w:tc>
+      </w:tr>
+      <w:tr>
+        <w:tc>
+          <w:tcPr>
+            <w:tcW w:type="dxa" w:w="2160"/>
+          </w:tcPr>
+          <w:p>
+            <w:r>
+              <w:rPr>
+                <w:sz w:val="16"/>
+              </w:rPr>
+              <w:t>Glide path targets</w:t>
+            </w:r>
+          </w:p>
+        </w:tc>
+        <w:tc>
+          <w:tcPr>
+            <w:tcW w:type="dxa" w:w="2160"/>
+          </w:tcPr>
+          <w:p>
+            <w:r>
+              <w:rPr>
+                <w:sz w:val="16"/>
+              </w:rPr>
+              <w:t>Year-by-year equity/bond/cash targets from glide_path.method between start_equity and end_equity.</w:t>
+            </w:r>
+          </w:p>
+        </w:tc>
+        <w:tc>
+          <w:tcPr>
+            <w:tcW w:type="dxa" w:w="2160"/>
+          </w:tcPr>
+          <w:p>
+            <w:r>
+              <w:rPr>
+                <w:sz w:val="16"/>
+              </w:rPr>
+              <w:t>The equity share each year is what the simulation rebalances toward; it is the model's main risk control.</w:t>
+            </w:r>
+          </w:p>
+        </w:tc>
+        <w:tc>
+          <w:tcPr>
+            <w:tcW w:type="dxa" w:w="2160"/>
+          </w:tcPr>
+          <w:p>
+            <w:r>
+              <w:rPr>
+                <w:sz w:val="16"/>
+              </w:rPr>
+              <w:t>Glide path changes risk, not expected return much. Its value shows up in drawdown and reserve-funding probabilities, not in the median.</w:t>
+            </w:r>
+          </w:p>
+        </w:tc>
+      </w:tr>
+      <w:tr>
+        <w:tc>
+          <w:tcPr>
+            <w:tcW w:type="dxa" w:w="2160"/>
+          </w:tcPr>
+          <w:p>
+            <w:r>
+              <w:rPr>
+                <w:sz w:val="16"/>
+              </w:rPr>
+              <w:t>Rebalancing band</w:t>
+            </w:r>
+          </w:p>
+        </w:tc>
+        <w:tc>
+          <w:tcPr>
+            <w:tcW w:type="dxa" w:w="2160"/>
+          </w:tcPr>
+          <w:p>
+            <w:r>
+              <w:rPr>
+                <w:sz w:val="16"/>
+              </w:rPr>
+              <w:t>Absolute: target +/- band percentage points. Relative: target x (1 +/- relative_band).</w:t>
+            </w:r>
+          </w:p>
+        </w:tc>
+        <w:tc>
+          <w:tcPr>
+            <w:tcW w:type="dxa" w:w="2160"/>
+          </w:tcPr>
+          <w:p>
+            <w:r>
+              <w:rPr>
+                <w:sz w:val="16"/>
+              </w:rPr>
+              <w:t>Tight bands mean more trades and more transaction cost; loose bands mean the glide path is advisory only.</w:t>
+            </w:r>
+          </w:p>
+        </w:tc>
+        <w:tc>
+          <w:tcPr>
+            <w:tcW w:type="dxa" w:w="2160"/>
+          </w:tcPr>
+          <w:p>
+            <w:r>
+              <w:rPr>
+                <w:sz w:val="16"/>
+              </w:rPr>
+              <w:t>Bands are tested on asset *class* weights at month end, not on individual holdings.</w:t>
+            </w:r>
+          </w:p>
+        </w:tc>
+      </w:tr>
+      <w:tr>
+        <w:tc>
+          <w:tcPr>
+            <w:tcW w:type="dxa" w:w="2160"/>
+          </w:tcPr>
+          <w:p>
+            <w:r>
+              <w:rPr>
+                <w:sz w:val="16"/>
+              </w:rPr>
+              <w:t>Turnover / rebalances (mean)</w:t>
+            </w:r>
+          </w:p>
+        </w:tc>
+        <w:tc>
+          <w:tcPr>
+            <w:tcW w:type="dxa" w:w="2160"/>
+          </w:tcPr>
+          <w:p>
+            <w:r>
+              <w:rPr>
+                <w:sz w:val="16"/>
+              </w:rPr>
+              <w:t>Sum over time of absolute weight changes per simulation; mean across simulations.</w:t>
+            </w:r>
+          </w:p>
+        </w:tc>
+        <w:tc>
+          <w:tcPr>
+            <w:tcW w:type="dxa" w:w="2160"/>
+          </w:tcPr>
+          <w:p>
+            <w:r>
+              <w:rPr>
+                <w:sz w:val="16"/>
+              </w:rPr>
+              <w:t>High turnover with tiny benefit means the band is too tight.</w:t>
+            </w:r>
+          </w:p>
+        </w:tc>
+        <w:tc>
+          <w:tcPr>
+            <w:tcW w:type="dxa" w:w="2160"/>
+          </w:tcPr>
+          <w:p>
+            <w:r>
+              <w:rPr>
+                <w:sz w:val="16"/>
+              </w:rPr>
+              <w:t>Turnover is not a cost. The cost is turnover x transaction_cost, already netted out of values.</w:t>
+            </w:r>
+          </w:p>
+        </w:tc>
+      </w:tr>
+      <w:tr>
+        <w:tc>
+          <w:tcPr>
+            <w:tcW w:type="dxa" w:w="2160"/>
+          </w:tcPr>
+          <w:p>
+            <w:r>
+              <w:rPr>
+                <w:sz w:val="16"/>
+              </w:rPr>
+              <w:t>Terminal value (2033)</w:t>
+            </w:r>
+          </w:p>
+        </w:tc>
+        <w:tc>
+          <w:tcPr>
+            <w:tcW w:type="dxa" w:w="2160"/>
+          </w:tcPr>
+          <w:p>
+            <w:r>
+              <w:rPr>
+                <w:sz w:val="16"/>
+              </w:rPr>
+              <w:t>Portfolio value at the end of the growth phase (month before the glide-end year), per simulation.</w:t>
+            </w:r>
+          </w:p>
+        </w:tc>
+        <w:tc>
+          <w:tcPr>
+            <w:tcW w:type="dxa" w:w="2160"/>
+          </w:tcPr>
+          <w:p>
+            <w:r>
+              <w:rPr>
+                <w:sz w:val="16"/>
+              </w:rPr>
+              <w:t>Read the distribution, not the average: p5 is the planning case, p50 the expected case, p95 the lucky case.</w:t>
+            </w:r>
+          </w:p>
+        </w:tc>
+        <w:tc>
+          <w:tcPr>
+            <w:tcW w:type="dxa" w:w="2160"/>
+          </w:tcPr>
+          <w:p>
+            <w:r>
+              <w:rPr>
+                <w:sz w:val="16"/>
+              </w:rPr>
+              <w:t>It is measured *before* the 2033-2042 payments are made, so it is not the money you end with.</w:t>
+            </w:r>
+          </w:p>
+        </w:tc>
+      </w:tr>
+      <w:tr>
+        <w:tc>
+          <w:tcPr>
+            <w:tcW w:type="dxa" w:w="2160"/>
+          </w:tcPr>
+          <w:p>
+            <w:r>
+              <w:rPr>
+                <w:sz w:val="16"/>
+              </w:rPr>
+              <w:t>Median terminal value</w:t>
+            </w:r>
+          </w:p>
+        </w:tc>
+        <w:tc>
+          <w:tcPr>
+            <w:tcW w:type="dxa" w:w="2160"/>
+          </w:tcPr>
+          <w:p>
+            <w:r>
+              <w:rPr>
+                <w:sz w:val="16"/>
+              </w:rPr>
+              <w:t>50th percentile of simulated 2033 values.</w:t>
+            </w:r>
+          </w:p>
+        </w:tc>
+        <w:tc>
+          <w:tcPr>
+            <w:tcW w:type="dxa" w:w="2160"/>
+          </w:tcPr>
+          <w:p>
+            <w:r>
+              <w:rPr>
+                <w:sz w:val="16"/>
+              </w:rPr>
+              <w:t>The headline number. Compare it across engines - if Monte Carlo and bootstrap disagree by more than 25%, the distribution shape is doing the work.</w:t>
+            </w:r>
+          </w:p>
+        </w:tc>
+        <w:tc>
+          <w:tcPr>
+            <w:tcW w:type="dxa" w:w="2160"/>
+          </w:tcPr>
+          <w:p>
+            <w:r>
+              <w:rPr>
+                <w:sz w:val="16"/>
+              </w:rPr>
+              <w:t>Median is not mean. With fat tails the mean is higher than the median, and the median is the safer one to quote.</w:t>
+            </w:r>
+          </w:p>
+        </w:tc>
+      </w:tr>
+      <w:tr>
+        <w:tc>
+          <w:tcPr>
+            <w:tcW w:type="dxa" w:w="2160"/>
+          </w:tcPr>
+          <w:p>
+            <w:r>
+              <w:rPr>
+                <w:sz w:val="16"/>
+              </w:rPr>
+              <w:t>Terminal percentiles (p5 ... p95)</w:t>
+            </w:r>
+          </w:p>
+        </w:tc>
+        <w:tc>
+          <w:tcPr>
+            <w:tcW w:type="dxa" w:w="2160"/>
+          </w:tcPr>
+          <w:p>
+            <w:r>
+              <w:rPr>
+                <w:sz w:val="16"/>
+              </w:rPr>
+              <w:t>Percentiles of the simulated 2033 value distribution.</w:t>
+            </w:r>
+          </w:p>
+        </w:tc>
+        <w:tc>
+          <w:tcPr>
+            <w:tcW w:type="dxa" w:w="2160"/>
+          </w:tcPr>
+          <w:p>
+            <w:r>
+              <w:rPr>
+                <w:sz w:val="16"/>
+              </w:rPr>
+              <w:t>p5 is the case you must survive; p95 is the case you must not plan for.</w:t>
+            </w:r>
+          </w:p>
+        </w:tc>
+        <w:tc>
+          <w:tcPr>
+            <w:tcW w:type="dxa" w:w="2160"/>
+          </w:tcPr>
+          <w:p>
+            <w:r>
+              <w:rPr>
+                <w:sz w:val="16"/>
+              </w:rPr>
+              <w:t>Percentiles from 10,000 simulations are stable to roughly +/-0.5pp in probability terms, not to the dollar.</w:t>
+            </w:r>
+          </w:p>
+        </w:tc>
+      </w:tr>
+      <w:tr>
+        <w:tc>
+          <w:tcPr>
+            <w:tcW w:type="dxa" w:w="2160"/>
+          </w:tcPr>
+          <w:p>
+            <w:r>
+              <w:rPr>
+                <w:sz w:val="16"/>
+              </w:rPr>
+              <w:t>Success: terminal &gt; contributions</w:t>
+            </w:r>
+          </w:p>
+        </w:tc>
+        <w:tc>
+          <w:tcPr>
+            <w:tcW w:type="dxa" w:w="2160"/>
+          </w:tcPr>
+          <w:p>
+            <w:r>
+              <w:rPr>
+                <w:sz w:val="16"/>
+              </w:rPr>
+              <w:t>Share of simulations where 2033 value &gt; total contributions (nominal).</w:t>
+            </w:r>
+          </w:p>
+        </w:tc>
+        <w:tc>
+          <w:tcPr>
+            <w:tcW w:type="dxa" w:w="2160"/>
+          </w:tcPr>
+          <w:p>
+            <w:r>
+              <w:rPr>
+                <w:sz w:val="16"/>
+              </w:rPr>
+              <w:t>92% sounds safe, but it is a nominal test against a 2027-28 figure.</w:t>
+            </w:r>
+          </w:p>
+        </w:tc>
+        <w:tc>
+          <w:tcPr>
+            <w:tcW w:type="dxa" w:w="2160"/>
+          </w:tcPr>
+          <w:p>
+            <w:r>
+              <w:rPr>
+                <w:sz w:val="16"/>
+              </w:rPr>
+              <w:t>Growing money in nominal terms while losing purchasing power still counts as success here.</w:t>
+            </w:r>
+          </w:p>
+        </w:tc>
+      </w:tr>
+      <w:tr>
+        <w:tc>
+          <w:tcPr>
+            <w:tcW w:type="dxa" w:w="2160"/>
+          </w:tcPr>
+          <w:p>
+            <w:r>
+              <w:rPr>
+                <w:sz w:val="16"/>
+              </w:rPr>
+              <w:t>Success above real capital</w:t>
+            </w:r>
+          </w:p>
+        </w:tc>
+        <w:tc>
+          <w:tcPr>
+            <w:tcW w:type="dxa" w:w="2160"/>
+          </w:tcPr>
+          <w:p>
+            <w:r>
+              <w:rPr>
+                <w:sz w:val="16"/>
+              </w:rPr>
+              <w:t>Share of simulations where 2033 value &gt; contributions x (1 + inflation)^(years to 2033).</w:t>
+            </w:r>
+          </w:p>
+        </w:tc>
+        <w:tc>
+          <w:tcPr>
+            <w:tcW w:type="dxa" w:w="2160"/>
+          </w:tcPr>
+          <w:p>
+            <w:r>
+              <w:rPr>
+                <w:sz w:val="16"/>
+              </w:rPr>
+              <w:t>This is the honest success number. The gap to the nominal version is the inflation tax.</w:t>
+            </w:r>
+          </w:p>
+        </w:tc>
+        <w:tc>
+          <w:tcPr>
+            <w:tcW w:type="dxa" w:w="2160"/>
+          </w:tcPr>
+          <w:p>
+            <w:r>
+              <w:rPr>
+                <w:sz w:val="16"/>
+              </w:rPr>
+              <w:t>It uses one inflation assumption; the scenario rows show the sensitivity.</w:t>
+            </w:r>
+          </w:p>
+        </w:tc>
+      </w:tr>
+      <w:tr>
+        <w:tc>
+          <w:tcPr>
+            <w:tcW w:type="dxa" w:w="2160"/>
+          </w:tcPr>
+          <w:p>
+            <w:r>
+              <w:rPr>
+                <w:sz w:val="16"/>
+              </w:rPr>
+              <w:t>Capital-floor probabilities</w:t>
+            </w:r>
+          </w:p>
+        </w:tc>
+        <w:tc>
+          <w:tcPr>
+            <w:tcW w:type="dxa" w:w="2160"/>
+          </w:tcPr>
+          <w:p>
+            <w:r>
+              <w:rPr>
+                <w:sz w:val="16"/>
+              </w:rPr>
+              <w:t>Share of simulations where terminal value &gt;= floor x inflation-adjusted contributions, for floors 100%, 90%, 80%, 70%.</w:t>
+            </w:r>
+          </w:p>
+        </w:tc>
+        <w:tc>
+          <w:tcPr>
+            <w:tcW w:type="dxa" w:w="2160"/>
+          </w:tcPr>
+          <w:p>
+            <w:r>
+              <w:rPr>
+                <w:sz w:val="16"/>
+              </w:rPr>
+              <w:t>A ladder, not a verdict: 95% chance of keeping 80% of real capital is a very different claim from 95% chance of keeping all of it.</w:t>
+            </w:r>
+          </w:p>
+        </w:tc>
+        <w:tc>
+          <w:tcPr>
+            <w:tcW w:type="dxa" w:w="2160"/>
+          </w:tcPr>
+          <w:p>
+            <w:r>
+              <w:rPr>
+                <w:sz w:val="16"/>
+              </w:rPr>
+              <w:t>Floors are relative to contributions, not to the reserve obligation.</w:t>
+            </w:r>
+          </w:p>
+        </w:tc>
+      </w:tr>
+      <w:tr>
+        <w:tc>
+          <w:tcPr>
+            <w:tcW w:type="dxa" w:w="2160"/>
+          </w:tcPr>
+          <w:p>
+            <w:r>
+              <w:rPr>
+                <w:sz w:val="16"/>
+              </w:rPr>
+              <w:t>Probability all reserve payments funded</w:t>
+            </w:r>
+          </w:p>
+        </w:tc>
+        <w:tc>
+          <w:tcPr>
+            <w:tcW w:type="dxa" w:w="2160"/>
+          </w:tcPr>
+          <w:p>
+            <w:r>
+              <w:rPr>
+                <w:sz w:val="16"/>
+              </w:rPr>
+              <w:t>Share of simulations where the reserve balance never goes below zero at any of the 10 payment dates.</w:t>
+            </w:r>
+          </w:p>
+        </w:tc>
+        <w:tc>
+          <w:tcPr>
+            <w:tcW w:type="dxa" w:w="2160"/>
+          </w:tcPr>
+          <w:p>
+            <w:r>
+              <w:rPr>
+                <w:sz w:val="16"/>
+              </w:rPr>
+              <w:t>The most decision-relevant number in the report. The bootstrap version is the one to plan against.</w:t>
+            </w:r>
+          </w:p>
+        </w:tc>
+        <w:tc>
+          <w:tcPr>
+            <w:tcW w:type="dxa" w:w="2160"/>
+          </w:tcPr>
+          <w:p>
+            <w:r>
+              <w:rPr>
+                <w:sz w:val="16"/>
+              </w:rPr>
+              <w:t>It requires the reserve to be intact at each payment date; a simulation that ends solvent but was empty in 2037 still fails.</w:t>
+            </w:r>
+          </w:p>
+        </w:tc>
+      </w:tr>
+      <w:tr>
+        <w:tc>
+          <w:tcPr>
+            <w:tcW w:type="dxa" w:w="2160"/>
+          </w:tcPr>
+          <w:p>
+            <w:r>
+              <w:rPr>
+                <w:sz w:val="16"/>
+              </w:rPr>
+              <w:t>Probability the facility gets nothing</w:t>
+            </w:r>
+          </w:p>
+        </w:tc>
+        <w:tc>
+          <w:tcPr>
+            <w:tcW w:type="dxa" w:w="2160"/>
+          </w:tcPr>
+          <w:p>
+            <w:r>
+              <w:rPr>
+                <w:sz w:val="16"/>
+              </w:rPr>
+              <w:t>Share of simulations where 2033 value &lt; required reserve.</w:t>
+            </w:r>
+          </w:p>
+        </w:tc>
+        <w:tc>
+          <w:tcPr>
+            <w:tcW w:type="dxa" w:w="2160"/>
+          </w:tcPr>
+          <w:p>
+            <w:r>
+              <w:rPr>
+                <w:sz w:val="16"/>
+              </w:rPr>
+              <w:t>High values mean the reserve is eating the whole portfolio by 2033.</w:t>
+            </w:r>
+          </w:p>
+        </w:tc>
+        <w:tc>
+          <w:tcPr>
+            <w:tcW w:type="dxa" w:w="2160"/>
+          </w:tcPr>
+          <w:p>
+            <w:r>
+              <w:rPr>
+                <w:sz w:val="16"/>
+              </w:rPr>
+              <w:t>Markov reports it as 1 - P(facility negative) in the comparison table; check the label before comparing rows.</w:t>
+            </w:r>
+          </w:p>
+        </w:tc>
+      </w:tr>
+      <w:tr>
+        <w:tc>
+          <w:tcPr>
+            <w:tcW w:type="dxa" w:w="2160"/>
+          </w:tcPr>
+          <w:p>
+            <w:r>
+              <w:rPr>
+                <w:sz w:val="16"/>
+              </w:rPr>
+              <w:t>Probability of capital depletion</w:t>
+            </w:r>
+          </w:p>
+        </w:tc>
+        <w:tc>
+          <w:tcPr>
+            <w:tcW w:type="dxa" w:w="2160"/>
+          </w:tcPr>
+          <w:p>
+            <w:r>
+              <w:rPr>
+                <w:sz w:val="16"/>
+              </w:rPr>
+              <w:t>Share of simulations where the 2033 value is essentially zero.</w:t>
+            </w:r>
+          </w:p>
+        </w:tc>
+        <w:tc>
+          <w:tcPr>
+            <w:tcW w:type="dxa" w:w="2160"/>
+          </w:tcPr>
+          <w:p>
+            <w:r>
+              <w:rPr>
+                <w:sz w:val="16"/>
+              </w:rPr>
+              <w:t>Usually near zero for a diversified stock/bond/cash mix. If it is not, the return assumptions or the model choice are extreme.</w:t>
+            </w:r>
+          </w:p>
+        </w:tc>
+        <w:tc>
+          <w:tcPr>
+            <w:tcW w:type="dxa" w:w="2160"/>
+          </w:tcPr>
+          <w:p>
+            <w:r>
+              <w:rPr>
+                <w:sz w:val="16"/>
+              </w:rPr>
+              <w:t>Zero here means the model's distribution produced a catastrophic path; real total loss also comes from forced selling, which is not modelled.</w:t>
+            </w:r>
+          </w:p>
+        </w:tc>
+      </w:tr>
+      <w:tr>
+        <w:tc>
+          <w:tcPr>
+            <w:tcW w:type="dxa" w:w="2160"/>
+          </w:tcPr>
+          <w:p>
+            <w:r>
+              <w:rPr>
+                <w:sz w:val="16"/>
+              </w:rPr>
+              <w:t>Max drawdown (growth phase)</w:t>
+            </w:r>
+          </w:p>
+        </w:tc>
+        <w:tc>
+          <w:tcPr>
+            <w:tcW w:type="dxa" w:w="2160"/>
+          </w:tcPr>
+          <w:p>
+            <w:r>
+              <w:rPr>
+                <w:sz w:val="16"/>
+              </w:rPr>
+              <w:t>Deepest peak-to-trough fall in each simulated path before the 2033 split; reported as a median and as probabilities of exceeding 10/20/30/40%.</w:t>
+            </w:r>
+          </w:p>
+        </w:tc>
+        <w:tc>
+          <w:tcPr>
+            <w:tcW w:type="dxa" w:w="2160"/>
+          </w:tcPr>
+          <w:p>
+            <w:r>
+              <w:rPr>
+                <w:sz w:val="16"/>
+              </w:rPr>
+              <w:t>Median max drawdown is the typical experience; P(&gt;20%) is the trigger for a portfolio review.</w:t>
+            </w:r>
+          </w:p>
+        </w:tc>
+        <w:tc>
+          <w:tcPr>
+            <w:tcW w:type="dxa" w:w="2160"/>
+          </w:tcPr>
+          <w:p>
+            <w:r>
+              <w:rPr>
+                <w:sz w:val="16"/>
+              </w:rPr>
+              <w:t>Measured on the growth phase only. Reserve-phase drawdowns are deliberately excluded because that money is already earmarked.</w:t>
+            </w:r>
+          </w:p>
+        </w:tc>
+      </w:tr>
+      <w:tr>
+        <w:tc>
+          <w:tcPr>
+            <w:tcW w:type="dxa" w:w="2160"/>
+          </w:tcPr>
+          <w:p>
+            <w:r>
+              <w:rPr>
+                <w:sz w:val="16"/>
+              </w:rPr>
+              <w:t>Expected CAGR (Monte Carlo)</w:t>
+            </w:r>
+          </w:p>
+        </w:tc>
+        <w:tc>
+          <w:tcPr>
+            <w:tcW w:type="dxa" w:w="2160"/>
+          </w:tcPr>
+          <w:p>
+            <w:r>
+              <w:rPr>
+                <w:sz w:val="16"/>
+              </w:rPr>
+              <w:t>(median terminal / total contributions)^(1 / years to 2033) - 1.</w:t>
+            </w:r>
+          </w:p>
+        </w:tc>
+        <w:tc>
+          <w:tcPr>
+            <w:tcW w:type="dxa" w:w="2160"/>
+          </w:tcPr>
+          <w:p>
+            <w:r>
+              <w:rPr>
+                <w:sz w:val="16"/>
+              </w:rPr>
+              <w:t>The bridge between the simulation and an intuitive rate. Compare it with historical CAGR to see how aggressive the assumptions are.</w:t>
+            </w:r>
+          </w:p>
+        </w:tc>
+        <w:tc>
+          <w:tcPr>
+            <w:tcW w:type="dxa" w:w="2160"/>
+          </w:tcPr>
+          <w:p>
+            <w:r>
+              <w:rPr>
+                <w:sz w:val="16"/>
+              </w:rPr>
+              <w:t>It uses contributions as the base, so a mid-period contribution drags it below the portfolio's own return.</w:t>
+            </w:r>
+          </w:p>
+        </w:tc>
+      </w:tr>
+      <w:tr>
+        <w:tc>
+          <w:tcPr>
+            <w:tcW w:type="dxa" w:w="2160"/>
+          </w:tcPr>
+          <w:p>
+            <w:r>
+              <w:rPr>
+                <w:sz w:val="16"/>
+              </w:rPr>
+              <w:t>2031 sponsor checkpoint</w:t>
+            </w:r>
+          </w:p>
+        </w:tc>
+        <w:tc>
+          <w:tcPr>
+            <w:tcW w:type="dxa" w:w="2160"/>
+          </w:tcPr>
+          <w:p>
+            <w:r>
+              <w:rPr>
+                <w:sz w:val="16"/>
+              </w:rPr>
+              <w:t>Percentiles of portfolio value at the start of 2031, and of value minus required reserve.</w:t>
+            </w:r>
+          </w:p>
+        </w:tc>
+        <w:tc>
+          <w:tcPr>
+            <w:tcW w:type="dxa" w:w="2160"/>
+          </w:tcPr>
+          <w:p>
+            <w:r>
+              <w:rPr>
+                <w:sz w:val="16"/>
+              </w:rPr>
+              <w:t>The projected-facility p5 at 2031 is the earliest honest signal that the reserve is at risk.</w:t>
+            </w:r>
+          </w:p>
+        </w:tc>
+        <w:tc>
+          <w:tcPr>
+            <w:tcW w:type="dxa" w:w="2160"/>
+          </w:tcPr>
+          <w:p>
+            <w:r>
+              <w:rPr>
+                <w:sz w:val="16"/>
+              </w:rPr>
+              <w:t>It is a snapshot, not a promise; two more years of market risk remain after it.</w:t>
+            </w:r>
+          </w:p>
+        </w:tc>
+      </w:tr>
+      <w:tr>
+        <w:tc>
+          <w:tcPr>
+            <w:tcW w:type="dxa" w:w="2160"/>
+          </w:tcPr>
+          <w:p>
+            <w:r>
+              <w:rPr>
+                <w:sz w:val="16"/>
+              </w:rPr>
+              <w:t>Monte Carlo engine</w:t>
+            </w:r>
+          </w:p>
+        </w:tc>
+        <w:tc>
+          <w:tcPr>
+            <w:tcW w:type="dxa" w:w="2160"/>
+          </w:tcPr>
+          <w:p>
+            <w:r>
+              <w:rPr>
+                <w:sz w:val="16"/>
+              </w:rPr>
+              <w:t>Monthly returns drawn from a parametric distribution (gaussian | lognormal | student_t | historical_residual) with the estimated mean vector and covariance, then run through the shared path engine.</w:t>
+            </w:r>
+          </w:p>
+        </w:tc>
+        <w:tc>
+          <w:tcPr>
+            <w:tcW w:type="dxa" w:w="2160"/>
+          </w:tcPr>
+          <w:p>
+            <w:r>
+              <w:rPr>
+                <w:sz w:val="16"/>
+              </w:rPr>
+              <w:t>Smooth, symmetric (unless Student-t), and only as good as the mean/covariance you fed it.</w:t>
+            </w:r>
+          </w:p>
+        </w:tc>
+        <w:tc>
+          <w:tcPr>
+            <w:tcW w:type="dxa" w:w="2160"/>
+          </w:tcPr>
+          <w:p>
+            <w:r>
+              <w:rPr>
+                <w:sz w:val="16"/>
+              </w:rPr>
+              <w:t>Gaussian Monte Carlo systematically understates crash frequency. Never use it alone for a reserve obligation.</w:t>
+            </w:r>
+          </w:p>
+        </w:tc>
+      </w:tr>
+      <w:tr>
+        <w:tc>
+          <w:tcPr>
+            <w:tcW w:type="dxa" w:w="2160"/>
+          </w:tcPr>
+          <w:p>
+            <w:r>
+              <w:rPr>
+                <w:sz w:val="16"/>
+              </w:rPr>
+              <w:t>Student-t simulation</w:t>
+            </w:r>
+          </w:p>
+        </w:tc>
+        <w:tc>
+          <w:tcPr>
+            <w:tcW w:type="dxa" w:w="2160"/>
+          </w:tcPr>
+          <w:p>
+            <w:r>
+              <w:rPr>
+                <w:sz w:val="16"/>
+              </w:rPr>
+              <w:t>Same covariance, with each month scaled by sqrt(dof / chi-square(dof)); dof = simulation.student_t_dof.</w:t>
+            </w:r>
+          </w:p>
+        </w:tc>
+        <w:tc>
+          <w:tcPr>
+            <w:tcW w:type="dxa" w:w="2160"/>
+          </w:tcPr>
+          <w:p>
+            <w:r>
+              <w:rPr>
+                <w:sz w:val="16"/>
+              </w:rPr>
+              <w:t>Lower p5, higher CVaR, lower reserve-funding probability than gaussian - and closer to how markets actually behave.</w:t>
+            </w:r>
+          </w:p>
+        </w:tc>
+        <w:tc>
+          <w:tcPr>
+            <w:tcW w:type="dxa" w:w="2160"/>
+          </w:tcPr>
+          <w:p>
+            <w:r>
+              <w:rPr>
+                <w:sz w:val="16"/>
+              </w:rPr>
+              <w:t>Fat tails also raise the variance of the estimate; you need more simulations for stable percentiles.</w:t>
+            </w:r>
+          </w:p>
+        </w:tc>
+      </w:tr>
+      <w:tr>
+        <w:tc>
+          <w:tcPr>
+            <w:tcW w:type="dxa" w:w="2160"/>
+          </w:tcPr>
+          <w:p>
+            <w:r>
+              <w:rPr>
+                <w:sz w:val="16"/>
+              </w:rPr>
+              <w:t>Historical bootstrap engine</w:t>
+            </w:r>
+          </w:p>
+        </w:tc>
+        <w:tc>
+          <w:tcPr>
+            <w:tcW w:type="dxa" w:w="2160"/>
+          </w:tcPr>
+          <w:p>
+            <w:r>
+              <w:rPr>
+                <w:sz w:val="16"/>
+              </w:rPr>
+              <w:t>Each simulation concatenates contiguous blocks of real historical joint daily returns (block bootstrap, block_size_days) covering the horizon, compounded to months, then run through the same path engine.</w:t>
+            </w:r>
+          </w:p>
+        </w:tc>
+        <w:tc>
+          <w:tcPr>
+            <w:tcW w:type="dxa" w:w="2160"/>
+          </w:tcPr>
+          <w:p>
+            <w:r>
+              <w:rPr>
+                <w:sz w:val="16"/>
+              </w:rPr>
+              <w:t>The reality check. It carries real crashes and real correlation behaviour, so it is usually the more conservative engine.</w:t>
+            </w:r>
+          </w:p>
+        </w:tc>
+        <w:tc>
+          <w:tcPr>
+            <w:tcW w:type="dxa" w:w="2160"/>
+          </w:tcPr>
+          <w:p>
+            <w:r>
+              <w:rPr>
+                <w:sz w:val="16"/>
+              </w:rPr>
+              <w:t>It cannot invent a crisis that never happened in the sample, and it inherits the sample's survivorship.</w:t>
+            </w:r>
+          </w:p>
+        </w:tc>
+      </w:tr>
+      <w:tr>
+        <w:tc>
+          <w:tcPr>
+            <w:tcW w:type="dxa" w:w="2160"/>
+          </w:tcPr>
+          <w:p>
+            <w:r>
+              <w:rPr>
+                <w:sz w:val="16"/>
+              </w:rPr>
+              <w:t>Block size (bootstrap)</w:t>
+            </w:r>
+          </w:p>
+        </w:tc>
+        <w:tc>
+          <w:tcPr>
+            <w:tcW w:type="dxa" w:w="2160"/>
+          </w:tcPr>
+          <w:p>
+            <w:r>
+              <w:rPr>
+                <w:sz w:val="16"/>
+              </w:rPr>
+              <w:t>Length of each contiguous historical window drawn (config bootstrap.block_size_days).</w:t>
+            </w:r>
+          </w:p>
+        </w:tc>
+        <w:tc>
+          <w:tcPr>
+            <w:tcW w:type="dxa" w:w="2160"/>
+          </w:tcPr>
+          <w:p>
+            <w:r>
+              <w:rPr>
+                <w:sz w:val="16"/>
+              </w:rPr>
+              <w:t>20 trading days keeps a month of momentum together; 1 day (iid) shuffles good and bad days apart and understates runs of bad news.</w:t>
+            </w:r>
+          </w:p>
+        </w:tc>
+        <w:tc>
+          <w:tcPr>
+            <w:tcW w:type="dxa" w:w="2160"/>
+          </w:tcPr>
+          <w:p>
+            <w:r>
+              <w:rPr>
+                <w:sz w:val="16"/>
+              </w:rPr>
+              <w:t>Larger blocks reduce the number of distinct combinations, so very large blocks make results lumpier.</w:t>
+            </w:r>
+          </w:p>
+        </w:tc>
+      </w:tr>
+      <w:tr>
+        <w:tc>
+          <w:tcPr>
+            <w:tcW w:type="dxa" w:w="2160"/>
+          </w:tcPr>
+          <w:p>
+            <w:r>
+              <w:rPr>
+                <w:sz w:val="16"/>
+              </w:rPr>
+              <w:t>Markov regime engine</w:t>
+            </w:r>
+          </w:p>
+        </w:tc>
+        <w:tc>
+          <w:tcPr>
+            <w:tcW w:type="dxa" w:w="2160"/>
+          </w:tcPr>
+          <w:p>
+            <w:r>
+              <w:rPr>
+                <w:sz w:val="16"/>
+              </w:rPr>
+              <w:t>Historical calendar-year portfolio returns are bucketed into 5 states by the configured thresholds; a 5x5 transition matrix is estimated from year-to-year moves; simulations draw state sequences and then a real return from the matching state.</w:t>
+            </w:r>
+          </w:p>
+        </w:tc>
+        <w:tc>
+          <w:tcPr>
+            <w:tcW w:type="dxa" w:w="2160"/>
+          </w:tcPr>
+          <w:p>
+            <w:r>
+              <w:rPr>
+                <w:sz w:val="16"/>
+              </w:rPr>
+              <w:t>It answers 'how likely is a bad stretch' better than it answers 'what is the terminal value'.</w:t>
+            </w:r>
+          </w:p>
+        </w:tc>
+        <w:tc>
+          <w:tcPr>
+            <w:tcW w:type="dxa" w:w="2160"/>
+          </w:tcPr>
+          <w:p>
+            <w:r>
+              <w:rPr>
+                <w:sz w:val="16"/>
+              </w:rPr>
+              <w:t>Estimated from roughly 25 annual observations. Each transition probability has a wide confidence interval, and unobserved states are assumed to persist.</w:t>
+            </w:r>
+          </w:p>
+        </w:tc>
+      </w:tr>
+      <w:tr>
+        <w:tc>
+          <w:tcPr>
+            <w:tcW w:type="dxa" w:w="2160"/>
+          </w:tcPr>
+          <w:p>
+            <w:r>
+              <w:rPr>
+                <w:sz w:val="16"/>
+              </w:rPr>
+              <w:t>Regime states and thresholds</w:t>
+            </w:r>
+          </w:p>
+        </w:tc>
+        <w:tc>
+          <w:tcPr>
+            <w:tcW w:type="dxa" w:w="2160"/>
+          </w:tcPr>
+          <w:p>
+            <w:r>
+              <w:rPr>
+                <w:sz w:val="16"/>
+              </w:rPr>
+              <w:t>severe_bear &lt; -20%, bear -20% to -5%, neutral -5% to +5%, bull +5% to +20%, strong_bull &gt; +20% of annual portfolio return (config markov.thresholds).</w:t>
+            </w:r>
+          </w:p>
+        </w:tc>
+        <w:tc>
+          <w:tcPr>
+            <w:tcW w:type="dxa" w:w="2160"/>
+          </w:tcPr>
+          <w:p>
+            <w:r>
+              <w:rPr>
+                <w:sz w:val="16"/>
+              </w:rPr>
+              <w:t>A portfolio-level -5% year is already 'bear' because the thresholds apply to the whole portfolio, not to the S&amp;P.</w:t>
+            </w:r>
+          </w:p>
+        </w:tc>
+        <w:tc>
+          <w:tcPr>
+            <w:tcW w:type="dxa" w:w="2160"/>
+          </w:tcPr>
+          <w:p>
+            <w:r>
+              <w:rPr>
+                <w:sz w:val="16"/>
+              </w:rPr>
+              <w:t>Thresholds are absolute, so a conservative bond-heavy portfolio may never leave 'neutral'.</w:t>
+            </w:r>
+          </w:p>
+        </w:tc>
+      </w:tr>
+      <w:tr>
+        <w:tc>
+          <w:tcPr>
+            <w:tcW w:type="dxa" w:w="2160"/>
+          </w:tcPr>
+          <w:p>
+            <w:r>
+              <w:rPr>
+                <w:sz w:val="16"/>
+              </w:rPr>
+              <w:t>Transition matrix P</w:t>
+            </w:r>
+          </w:p>
+        </w:tc>
+        <w:tc>
+          <w:tcPr>
+            <w:tcW w:type="dxa" w:w="2160"/>
+          </w:tcPr>
+          <w:p>
+            <w:r>
+              <w:rPr>
+                <w:sz w:val="16"/>
+              </w:rPr>
+              <w:t>P[i][j] = share of historical years in state i that were followed by a year in state j.</w:t>
+            </w:r>
+          </w:p>
+        </w:tc>
+        <w:tc>
+          <w:tcPr>
+            <w:tcW w:type="dxa" w:w="2160"/>
+          </w:tcPr>
+          <w:p>
+            <w:r>
+              <w:rPr>
+                <w:sz w:val="16"/>
+              </w:rPr>
+              <w:t>A high diagonal means regimes persist - bad years come in runs.</w:t>
+            </w:r>
+          </w:p>
+        </w:tc>
+        <w:tc>
+          <w:tcPr>
+            <w:tcW w:type="dxa" w:w="2160"/>
+          </w:tcPr>
+          <w:p>
+            <w:r>
+              <w:rPr>
+                <w:sz w:val="16"/>
+              </w:rPr>
+              <w:t>Rows built from one or two observations are not probabilities, they are anecdotes; the engine marks unobserved rows as persistent.</w:t>
+            </w:r>
+          </w:p>
+        </w:tc>
+      </w:tr>
+      <w:tr>
+        <w:tc>
+          <w:tcPr>
+            <w:tcW w:type="dxa" w:w="2160"/>
+          </w:tcPr>
+          <w:p>
+            <w:r>
+              <w:rPr>
+                <w:sz w:val="16"/>
+              </w:rPr>
+              <w:t>Stationary distribution</w:t>
+            </w:r>
+          </w:p>
+        </w:tc>
+        <w:tc>
+          <w:tcPr>
+            <w:tcW w:type="dxa" w:w="2160"/>
+          </w:tcPr>
+          <w:p>
+            <w:r>
+              <w:rPr>
+                <w:sz w:val="16"/>
+              </w:rPr>
+              <w:t>Long-run share of years in each state implied by P (left eigenvector at 1).</w:t>
+            </w:r>
+          </w:p>
+        </w:tc>
+        <w:tc>
+          <w:tcPr>
+            <w:tcW w:type="dxa" w:w="2160"/>
+          </w:tcPr>
+          <w:p>
+            <w:r>
+              <w:rPr>
+                <w:sz w:val="16"/>
+              </w:rPr>
+              <w:t>If the stationary bear share is 25%, expect roughly one year in four to be a bear year over a long horizon.</w:t>
+            </w:r>
+          </w:p>
+        </w:tc>
+        <w:tc>
+          <w:tcPr>
+            <w:tcW w:type="dxa" w:w="2160"/>
+          </w:tcPr>
+          <w:p>
+            <w:r>
+              <w:rPr>
+                <w:sz w:val="16"/>
+              </w:rPr>
+              <w:t>It assumes the process is stable forever, which no market is.</w:t>
+            </w:r>
+          </w:p>
+        </w:tc>
+      </w:tr>
+      <w:tr>
+        <w:tc>
+          <w:tcPr>
+            <w:tcW w:type="dxa" w:w="2160"/>
+          </w:tcPr>
+          <w:p>
+            <w:r>
+              <w:rPr>
+                <w:sz w:val="16"/>
+              </w:rPr>
+              <w:t>Expected regime duration</w:t>
+            </w:r>
+          </w:p>
+        </w:tc>
+        <w:tc>
+          <w:tcPr>
+            <w:tcW w:type="dxa" w:w="2160"/>
+          </w:tcPr>
+          <w:p>
+            <w:r>
+              <w:rPr>
+                <w:sz w:val="16"/>
+              </w:rPr>
+              <w:t>1 / (1 - P[state][state]).</w:t>
+            </w:r>
+          </w:p>
+        </w:tc>
+        <w:tc>
+          <w:tcPr>
+            <w:tcW w:type="dxa" w:w="2160"/>
+          </w:tcPr>
+          <w:p>
+            <w:r>
+              <w:rPr>
+                <w:sz w:val="16"/>
+              </w:rPr>
+              <w:t>A 2.5-year expected bear duration means a bad stretch is likely to span more than one planning year.</w:t>
+            </w:r>
+          </w:p>
+        </w:tc>
+        <w:tc>
+          <w:tcPr>
+            <w:tcW w:type="dxa" w:w="2160"/>
+          </w:tcPr>
+          <w:p>
+            <w:r>
+              <w:rPr>
+                <w:sz w:val="16"/>
+              </w:rPr>
+              <w:t>Mean duration says nothing about the worst case; runs can be far longer.</w:t>
+            </w:r>
+          </w:p>
+        </w:tc>
+      </w:tr>
+      <w:tr>
+        <w:tc>
+          <w:tcPr>
+            <w:tcW w:type="dxa" w:w="2160"/>
+          </w:tcPr>
+          <w:p>
+            <w:r>
+              <w:rPr>
+                <w:sz w:val="16"/>
+              </w:rPr>
+              <w:t>P(bear at any point 2027-2032)</w:t>
+            </w:r>
+          </w:p>
+        </w:tc>
+        <w:tc>
+          <w:tcPr>
+            <w:tcW w:type="dxa" w:w="2160"/>
+          </w:tcPr>
+          <w:p>
+            <w:r>
+              <w:rPr>
+                <w:sz w:val="16"/>
+              </w:rPr>
+              <w:t>Share of Markov simulations where at least one growth-phase year lands in bear or severe_bear.</w:t>
+            </w:r>
+          </w:p>
+        </w:tc>
+        <w:tc>
+          <w:tcPr>
+            <w:tcW w:type="dxa" w:w="2160"/>
+          </w:tcPr>
+          <w:p>
+            <w:r>
+              <w:rPr>
+                <w:sz w:val="16"/>
+              </w:rPr>
+              <w:t>Usually high. It is a near-certainty statement, which is why it should not be used as an alarm by itself.</w:t>
+            </w:r>
+          </w:p>
+        </w:tc>
+        <w:tc>
+          <w:tcPr>
+            <w:tcW w:type="dxa" w:w="2160"/>
+          </w:tcPr>
+          <w:p>
+            <w:r>
+              <w:rPr>
+                <w:sz w:val="16"/>
+              </w:rPr>
+              <w:t>'At least one bear year' is a low bar; 60% here does not mean 60% chance of failure.</w:t>
+            </w:r>
+          </w:p>
+        </w:tc>
+      </w:tr>
+      <w:tr>
+        <w:tc>
+          <w:tcPr>
+            <w:tcW w:type="dxa" w:w="2160"/>
+          </w:tcPr>
+          <w:p>
+            <w:r>
+              <w:rPr>
+                <w:sz w:val="16"/>
+              </w:rPr>
+              <w:t>P(bull by 2032)</w:t>
+            </w:r>
+          </w:p>
+        </w:tc>
+        <w:tc>
+          <w:tcPr>
+            <w:tcW w:type="dxa" w:w="2160"/>
+          </w:tcPr>
+          <w:p>
+            <w:r>
+              <w:rPr>
+                <w:sz w:val="16"/>
+              </w:rPr>
+              <w:t>Share of Markov simulations whose final growth-phase year is bull or strong_bull.</w:t>
+            </w:r>
+          </w:p>
+        </w:tc>
+        <w:tc>
+          <w:tcPr>
+            <w:tcW w:type="dxa" w:w="2160"/>
+          </w:tcPr>
+          <w:p>
+            <w:r>
+              <w:rPr>
+                <w:sz w:val="16"/>
+              </w:rPr>
+              <w:t>Arriving in a bull year is favourable for the split, but it says nothing about the path taken to get there.</w:t>
+            </w:r>
+          </w:p>
+        </w:tc>
+        <w:tc>
+          <w:tcPr>
+            <w:tcW w:type="dxa" w:w="2160"/>
+          </w:tcPr>
+          <w:p>
+            <w:r>
+              <w:rPr>
+                <w:sz w:val="16"/>
+              </w:rPr>
+              <w:t>A bull final year is compatible with a -35% drawdown in 2029.</w:t>
+            </w:r>
+          </w:p>
+        </w:tc>
+      </w:tr>
+      <w:tr>
+        <w:tc>
+          <w:tcPr>
+            <w:tcW w:type="dxa" w:w="2160"/>
+          </w:tcPr>
+          <w:p>
+            <w:r>
+              <w:rPr>
+                <w:sz w:val="16"/>
+              </w:rPr>
+              <w:t>VaR (value at risk)</w:t>
+            </w:r>
+          </w:p>
+        </w:tc>
+        <w:tc>
+          <w:tcPr>
+            <w:tcW w:type="dxa" w:w="2160"/>
+          </w:tcPr>
+          <w:p>
+            <w:r>
+              <w:rPr>
+                <w:sz w:val="16"/>
+              </w:rPr>
+              <w:t>Historical: -quantile(returns, 1 - confidence). Parametric: -(mean + z x std). Monte Carlo: -quantile of simulated terminal return vs contributions.</w:t>
+            </w:r>
+          </w:p>
+        </w:tc>
+        <w:tc>
+          <w:tcPr>
+            <w:tcW w:type="dxa" w:w="2160"/>
+          </w:tcPr>
+          <w:p>
+            <w:r>
+              <w:rPr>
+                <w:sz w:val="16"/>
+              </w:rPr>
+              <w:t>VaR 95% = 4% means 19 months in 20 lose less than 4%; it says nothing about how bad the 20th month is.</w:t>
+            </w:r>
+          </w:p>
+        </w:tc>
+        <w:tc>
+          <w:tcPr>
+            <w:tcW w:type="dxa" w:w="2160"/>
+          </w:tcPr>
+          <w:p>
+            <w:r>
+              <w:rPr>
+                <w:sz w:val="16"/>
+              </w:rPr>
+              <w:t>Sign convention: VaR is reported as a positive loss. A 'VaR 95% = 0.04' means a 4% loss, not a 4% gain; a NEGATIVE VaR means the 5th-percentile outcome is itself a gain. Historical, parametric and Monte Carlo VaR are computed on different horizons and bases - never compare them directly.</w:t>
+            </w:r>
+          </w:p>
+        </w:tc>
+      </w:tr>
+      <w:tr>
+        <w:tc>
+          <w:tcPr>
+            <w:tcW w:type="dxa" w:w="2160"/>
+          </w:tcPr>
+          <w:p>
+            <w:r>
+              <w:rPr>
+                <w:sz w:val="16"/>
+              </w:rPr>
+              <w:t>CVaR / expected shortfall</w:t>
+            </w:r>
+          </w:p>
+        </w:tc>
+        <w:tc>
+          <w:tcPr>
+            <w:tcW w:type="dxa" w:w="2160"/>
+          </w:tcPr>
+          <w:p>
+            <w:r>
+              <w:rPr>
+                <w:sz w:val="16"/>
+              </w:rPr>
+              <w:t>Negative of the mean of returns at or beyond the VaR quantile.</w:t>
+            </w:r>
+          </w:p>
+        </w:tc>
+        <w:tc>
+          <w:tcPr>
+            <w:tcW w:type="dxa" w:w="2160"/>
+          </w:tcPr>
+          <w:p>
+            <w:r>
+              <w:rPr>
+                <w:sz w:val="16"/>
+              </w:rPr>
+              <w:t>CVaR is the number that should size a reserve. If CVaR95 is 30%, the worst 5% of outcomes lose a third on average.</w:t>
+            </w:r>
+          </w:p>
+        </w:tc>
+        <w:tc>
+          <w:tcPr>
+            <w:tcW w:type="dxa" w:w="2160"/>
+          </w:tcPr>
+          <w:p>
+            <w:r>
+              <w:rPr>
+                <w:sz w:val="16"/>
+              </w:rPr>
+              <w:t>Terminal CVaR is measured on the 2033 outcome relative to contributions over six years, not on a month. It is a horizon loss, not a monthly one. A NEGATIVE CVaR is not an error: it means that even the worst 5% of simulated outcomes are, on average, still gains - the tail is not loss-making under these assumptions.</w:t>
+            </w:r>
+          </w:p>
+        </w:tc>
+      </w:tr>
+      <w:tr>
+        <w:tc>
+          <w:tcPr>
+            <w:tcW w:type="dxa" w:w="2160"/>
+          </w:tcPr>
+          <w:p>
+            <w:r>
+              <w:rPr>
+                <w:sz w:val="16"/>
+              </w:rPr>
+              <w:t>Horizon warning (VaR rows)</w:t>
+            </w:r>
+          </w:p>
+        </w:tc>
+        <w:tc>
+          <w:tcPr>
+            <w:tcW w:type="dxa" w:w="2160"/>
+          </w:tcPr>
+          <w:p>
+            <w:r>
+              <w:rPr>
+                <w:sz w:val="16"/>
+              </w:rPr>
+              <w:t>Risk-sheet VaR/CVaR rows are one-month horizon; comparison-table VaR/CVaR rows are 2033 terminal horizon.</w:t>
+            </w:r>
+          </w:p>
+        </w:tc>
+        <w:tc>
+          <w:tcPr>
+            <w:tcW w:type="dxa" w:w="2160"/>
+          </w:tcPr>
+          <w:p>
+            <w:r>
+              <w:rPr>
+                <w:sz w:val="16"/>
+              </w:rPr>
+              <w:t>A 4% monthly VaR and a 30% terminal VaR are consistent, not contradictory.</w:t>
+            </w:r>
+          </w:p>
+        </w:tc>
+        <w:tc>
+          <w:tcPr>
+            <w:tcW w:type="dxa" w:w="2160"/>
+          </w:tcPr>
+          <w:p>
+            <w:r>
+              <w:rPr>
+                <w:sz w:val="16"/>
+              </w:rPr>
+              <w:t>This is the single most common misreading in the workbook.</w:t>
+            </w:r>
+          </w:p>
+        </w:tc>
+      </w:tr>
+      <w:tr>
+        <w:tc>
+          <w:tcPr>
+            <w:tcW w:type="dxa" w:w="2160"/>
+          </w:tcPr>
+          <w:p>
+            <w:r>
+              <w:rPr>
+                <w:sz w:val="16"/>
+              </w:rPr>
+              <w:t>Sensitivity grid</w:t>
+            </w:r>
+          </w:p>
+        </w:tc>
+        <w:tc>
+          <w:tcPr>
+            <w:tcW w:type="dxa" w:w="2160"/>
+          </w:tcPr>
+          <w:p>
+            <w:r>
+              <w:rPr>
+                <w:sz w:val="16"/>
+              </w:rPr>
+              <w:t>For each (return shift, volatility multiplier) pair, re-run the simulation and record median terminal, p5, success probability, reserve-funding probability, median drawdown, VaR/CVaR.</w:t>
+            </w:r>
+          </w:p>
+        </w:tc>
+        <w:tc>
+          <w:tcPr>
+            <w:tcW w:type="dxa" w:w="2160"/>
+          </w:tcPr>
+          <w:p>
+            <w:r>
+              <w:rPr>
+                <w:sz w:val="16"/>
+              </w:rPr>
+              <w:t>Find the base cell (shift 0, multiplier 1.0), then walk outward. A plan whose success collapses one row away is fragile.</w:t>
+            </w:r>
+          </w:p>
+        </w:tc>
+        <w:tc>
+          <w:tcPr>
+            <w:tcW w:type="dxa" w:w="2160"/>
+          </w:tcPr>
+          <w:p>
+            <w:r>
+              <w:rPr>
+                <w:sz w:val="16"/>
+              </w:rPr>
+              <w:t>Return shifts are applied to every asset equally; it is a systematic shock, not a single-name change.</w:t>
+            </w:r>
+          </w:p>
+        </w:tc>
+      </w:tr>
+      <w:tr>
+        <w:tc>
+          <w:tcPr>
+            <w:tcW w:type="dxa" w:w="2160"/>
+          </w:tcPr>
+          <w:p>
+            <w:r>
+              <w:rPr>
+                <w:sz w:val="16"/>
+              </w:rPr>
+              <w:t>Minimum return shift for 90% success</w:t>
+            </w:r>
+          </w:p>
+        </w:tc>
+        <w:tc>
+          <w:tcPr>
+            <w:tcW w:type="dxa" w:w="2160"/>
+          </w:tcPr>
+          <w:p>
+            <w:r>
+              <w:rPr>
+                <w:sz w:val="16"/>
+              </w:rPr>
+              <w:t>Smallest return shift in the grid where success probability is still at or above 90%.</w:t>
+            </w:r>
+          </w:p>
+        </w:tc>
+        <w:tc>
+          <w:tcPr>
+            <w:tcW w:type="dxa" w:w="2160"/>
+          </w:tcPr>
+          <w:p>
+            <w:r>
+              <w:rPr>
+                <w:sz w:val="16"/>
+              </w:rPr>
+              <w:t>-2% means the plan survives 2pp lower returns everywhere. A value near 0 means no margin at all.</w:t>
+            </w:r>
+          </w:p>
+        </w:tc>
+        <w:tc>
+          <w:tcPr>
+            <w:tcW w:type="dxa" w:w="2160"/>
+          </w:tcPr>
+          <w:p>
+            <w:r>
+              <w:rPr>
+                <w:sz w:val="16"/>
+              </w:rPr>
+              <w:t>It is found at the grid's coarse 1pp steps.</w:t>
+            </w:r>
+          </w:p>
+        </w:tc>
+      </w:tr>
+      <w:tr>
+        <w:tc>
+          <w:tcPr>
+            <w:tcW w:type="dxa" w:w="2160"/>
+          </w:tcPr>
+          <w:p>
+            <w:r>
+              <w:rPr>
+                <w:sz w:val="16"/>
+              </w:rPr>
+              <w:t>Fragile volatility threshold</w:t>
+            </w:r>
+          </w:p>
+        </w:tc>
+        <w:tc>
+          <w:tcPr>
+            <w:tcW w:type="dxa" w:w="2160"/>
+          </w:tcPr>
+          <w:p>
+            <w:r>
+              <w:rPr>
+                <w:sz w:val="16"/>
+              </w:rPr>
+              <w:t>At the base return assumption, the smallest volatility multiplier &gt;= 1.0 where success falls below 75%.</w:t>
+            </w:r>
+          </w:p>
+        </w:tc>
+        <w:tc>
+          <w:tcPr>
+            <w:tcW w:type="dxa" w:w="2160"/>
+          </w:tcPr>
+          <w:p>
+            <w:r>
+              <w:rPr>
+                <w:sz w:val="16"/>
+              </w:rPr>
+              <w:t>1.1 means a 10% increase in volatility breaks the plan; 1.5 means it is robust to a 50% volatility regime shift.</w:t>
+            </w:r>
+          </w:p>
+        </w:tc>
+        <w:tc>
+          <w:tcPr>
+            <w:tcW w:type="dxa" w:w="2160"/>
+          </w:tcPr>
+          <w:p>
+            <w:r>
+              <w:rPr>
+                <w:sz w:val="16"/>
+              </w:rPr>
+              <w:t>Volatility is scaled, not returns: it widens the distribution without changing the average.</w:t>
+            </w:r>
+          </w:p>
+        </w:tc>
+      </w:tr>
+      <w:tr>
+        <w:tc>
+          <w:tcPr>
+            <w:tcW w:type="dxa" w:w="2160"/>
+          </w:tcPr>
+          <w:p>
+            <w:r>
+              <w:rPr>
+                <w:sz w:val="16"/>
+              </w:rPr>
+              <w:t>Sharpe proxy (sensitivity grid)</w:t>
+            </w:r>
+          </w:p>
+        </w:tc>
+        <w:tc>
+          <w:tcPr>
+            <w:tcW w:type="dxa" w:w="2160"/>
+          </w:tcPr>
+          <w:p>
+            <w:r>
+              <w:rPr>
+                <w:sz w:val="16"/>
+              </w:rPr>
+              <w:t>Mean / standard deviation of the simulated annualised terminal outcomes in that grid cell.</w:t>
+            </w:r>
+          </w:p>
+        </w:tc>
+        <w:tc>
+          <w:tcPr>
+            <w:tcW w:type="dxa" w:w="2160"/>
+          </w:tcPr>
+          <w:p>
+            <w:r>
+              <w:rPr>
+                <w:sz w:val="16"/>
+              </w:rPr>
+              <w:t>Use it to rank cells against each other; do not compare it with the historical Sharpe on the dashboard.</w:t>
+            </w:r>
+          </w:p>
+        </w:tc>
+        <w:tc>
+          <w:tcPr>
+            <w:tcW w:type="dxa" w:w="2160"/>
+          </w:tcPr>
+          <w:p>
+            <w:r>
+              <w:rPr>
+                <w:sz w:val="16"/>
+              </w:rPr>
+              <w:t>It is computed on terminal outcomes over the whole horizon, so it is not annual return over annual volatility.</w:t>
+            </w:r>
+          </w:p>
+        </w:tc>
+      </w:tr>
+      <w:tr>
+        <w:tc>
+          <w:tcPr>
+            <w:tcW w:type="dxa" w:w="2160"/>
+          </w:tcPr>
+          <w:p>
+            <w:r>
+              <w:rPr>
+                <w:sz w:val="16"/>
+              </w:rPr>
+              <w:t>Historical crisis replay</w:t>
+            </w:r>
+          </w:p>
+        </w:tc>
+        <w:tc>
+          <w:tcPr>
+            <w:tcW w:type="dxa" w:w="2160"/>
+          </w:tcPr>
+          <w:p>
+            <w:r>
+              <w:rPr>
+                <w:sz w:val="16"/>
+              </w:rPr>
+              <w:t>Apply the actual daily returns of your holdings during a configured window (2008, 2020, 2022) to current weights and report portfolio return, worst holding, sector contributions and benchmark comparison.</w:t>
+            </w:r>
+          </w:p>
+        </w:tc>
+        <w:tc>
+          <w:tcPr>
+            <w:tcW w:type="dxa" w:w="2160"/>
+          </w:tcPr>
+          <w:p>
+            <w:r>
+              <w:rPr>
+                <w:sz w:val="16"/>
+              </w:rPr>
+              <w:t>The most persuasive evidence in the report because it uses no assumptions at all - only what happened.</w:t>
+            </w:r>
+          </w:p>
+        </w:tc>
+        <w:tc>
+          <w:tcPr>
+            <w:tcW w:type="dxa" w:w="2160"/>
+          </w:tcPr>
+          <w:p>
+            <w:r>
+              <w:rPr>
+                <w:sz w:val="16"/>
+              </w:rPr>
+              <w:t>It is a static snapshot: no rebalancing, no glide path, no contributions during the window. Holdings that did not exist then are excluded.</w:t>
+            </w:r>
+          </w:p>
+        </w:tc>
+      </w:tr>
+      <w:tr>
+        <w:tc>
+          <w:tcPr>
+            <w:tcW w:type="dxa" w:w="2160"/>
+          </w:tcPr>
+          <w:p>
+            <w:r>
+              <w:rPr>
+                <w:sz w:val="16"/>
+              </w:rPr>
+              <w:t>Hypothetical scenario shocks</w:t>
+            </w:r>
+          </w:p>
+        </w:tc>
+        <w:tc>
+          <w:tcPr>
+            <w:tcW w:type="dxa" w:w="2160"/>
+          </w:tcPr>
+          <w:p>
+            <w:r>
+              <w:rPr>
+                <w:sz w:val="16"/>
+              </w:rPr>
+              <w:t>Apply configured asset-class/sector shocks (severe equity crash, stagflation, recession, inflation shock) to current weights.</w:t>
+            </w:r>
+          </w:p>
+        </w:tc>
+        <w:tc>
+          <w:tcPr>
+            <w:tcW w:type="dxa" w:w="2160"/>
+          </w:tcPr>
+          <w:p>
+            <w:r>
+              <w:rPr>
+                <w:sz w:val="16"/>
+              </w:rPr>
+              <w:t>Use it to test whether the defensive sleeve actually defends. A stagflation scenario that loses 25% means it does not.</w:t>
+            </w:r>
+          </w:p>
+        </w:tc>
+        <w:tc>
+          <w:tcPr>
+            <w:tcW w:type="dxa" w:w="2160"/>
+          </w:tcPr>
+          <w:p>
+            <w:r>
+              <w:rPr>
+                <w:sz w:val="16"/>
+              </w:rPr>
+              <w:t>Shocks are applied once, instantaneously, to today's weights. There is no recovery and no management response.</w:t>
+            </w:r>
+          </w:p>
+        </w:tc>
+      </w:tr>
+      <w:tr>
+        <w:tc>
+          <w:tcPr>
+            <w:tcW w:type="dxa" w:w="2160"/>
+          </w:tcPr>
+          <w:p>
+            <w:r>
+              <w:rPr>
+                <w:sz w:val="16"/>
+              </w:rPr>
+              <w:t>Stop-loss backtest</w:t>
+            </w:r>
+          </w:p>
+        </w:tc>
+        <w:tc>
+          <w:tcPr>
+            <w:tcW w:type="dxa" w:w="2160"/>
+          </w:tcPr>
+          <w:p>
+            <w:r>
+              <w:rPr>
+                <w:sz w:val="16"/>
+              </w:rPr>
+              <w:t>For each holding: hold, exit at the close that breaches a hard (vs entry) or trailing (vs running peak) stop, re-enter after 21 trading days; compare CAGR, volatility, Sharpe, Sortino, max drawdown, exits, turnover and missed upside against buy-and-hold.</w:t>
+            </w:r>
+          </w:p>
+        </w:tc>
+        <w:tc>
+          <w:tcPr>
+            <w:tcW w:type="dxa" w:w="2160"/>
+          </w:tcPr>
+          <w:p>
+            <w:r>
+              <w:rPr>
+                <w:sz w:val="16"/>
+              </w:rPr>
+              <w:t>A stop that cuts max drawdown a lot while giving up little CAGR is worth considering. One that cuts CAGR materially is a drag.</w:t>
+            </w:r>
+          </w:p>
+        </w:tc>
+        <w:tc>
+          <w:tcPr>
+            <w:tcW w:type="dxa" w:w="2160"/>
+          </w:tcPr>
+          <w:p>
+            <w:r>
+              <w:rPr>
+                <w:sz w:val="16"/>
+              </w:rPr>
+              <w:t>Historical backtest on adjusted prices with a fixed 21-day re-entry. It is not advice, and it ignores taxes, slippage and the behavioural value of a stop.</w:t>
+            </w:r>
+          </w:p>
+        </w:tc>
+      </w:tr>
+      <w:tr>
+        <w:tc>
+          <w:tcPr>
+            <w:tcW w:type="dxa" w:w="2160"/>
+          </w:tcPr>
+          <w:p>
+            <w:r>
+              <w:rPr>
+                <w:sz w:val="16"/>
+              </w:rPr>
+              <w:t>Missed upside (stop backtest)</w:t>
+            </w:r>
+          </w:p>
+        </w:tc>
+        <w:tc>
+          <w:tcPr>
+            <w:tcW w:type="dxa" w:w="2160"/>
+          </w:tcPr>
+          <w:p>
+            <w:r>
+              <w:rPr>
+                <w:sz w:val="16"/>
+              </w:rPr>
+              <w:t>Sum of buy-and-hold returns minus sum of stopped-path returns over the same period.</w:t>
+            </w:r>
+          </w:p>
+        </w:tc>
+        <w:tc>
+          <w:tcPr>
+            <w:tcW w:type="dxa" w:w="2160"/>
+          </w:tcPr>
+          <w:p>
+            <w:r>
+              <w:rPr>
+                <w:sz w:val="16"/>
+              </w:rPr>
+              <w:t>Positive means the stop cost you return; negative means the stop helped.</w:t>
+            </w:r>
+          </w:p>
+        </w:tc>
+        <w:tc>
+          <w:tcPr>
+            <w:tcW w:type="dxa" w:w="2160"/>
+          </w:tcPr>
+          <w:p>
+            <w:r>
+              <w:rPr>
+                <w:sz w:val="16"/>
+              </w:rPr>
+              <w:t>It is a cumulative arithmetic difference, not an annualised figure.</w:t>
+            </w:r>
+          </w:p>
+        </w:tc>
+      </w:tr>
+      <w:tr>
+        <w:tc>
+          <w:tcPr>
+            <w:tcW w:type="dxa" w:w="2160"/>
+          </w:tcPr>
+          <w:p>
+            <w:r>
+              <w:rPr>
+                <w:sz w:val="16"/>
+              </w:rPr>
+              <w:t>Suggested allocation (max-Sharpe diagnostic)</w:t>
+            </w:r>
+          </w:p>
+        </w:tc>
+        <w:tc>
+          <w:tcPr>
+            <w:tcW w:type="dxa" w:w="2160"/>
+          </w:tcPr>
+          <w:p>
+            <w:r>
+              <w:rPr>
+                <w:sz w:val="16"/>
+              </w:rPr>
+              <w:t>SLSQP optimisation of expected return / volatility subject to weights summing to 1, per-position cap, cash floor and correlated-group caps.</w:t>
+            </w:r>
+          </w:p>
+        </w:tc>
+        <w:tc>
+          <w:tcPr>
+            <w:tcW w:type="dxa" w:w="2160"/>
+          </w:tcPr>
+          <w:p>
+            <w:r>
+              <w:rPr>
+                <w:sz w:val="16"/>
+              </w:rPr>
+              <w:t>Read the *differences* column, not the levels: it shows which positions the assumptions want bigger or smaller.</w:t>
+            </w:r>
+          </w:p>
+        </w:tc>
+        <w:tc>
+          <w:tcPr>
+            <w:tcW w:type="dxa" w:w="2160"/>
+          </w:tcPr>
+          <w:p>
+            <w:r>
+              <w:rPr>
+                <w:sz w:val="16"/>
+              </w:rPr>
+              <w:t>Optimisers amplify estimation error: a suggested weight is only as good as the expected-return input, and small input changes can move weights a lot.</w:t>
+            </w:r>
+          </w:p>
+        </w:tc>
+      </w:tr>
+      <w:tr>
+        <w:tc>
+          <w:tcPr>
+            <w:tcW w:type="dxa" w:w="2160"/>
+          </w:tcPr>
+          <w:p>
+            <w:r>
+              <w:rPr>
+                <w:sz w:val="16"/>
+              </w:rPr>
+              <w:t>Rule flag</w:t>
+            </w:r>
+          </w:p>
+        </w:tc>
+        <w:tc>
+          <w:tcPr>
+            <w:tcW w:type="dxa" w:w="2160"/>
+          </w:tcPr>
+          <w:p>
+            <w:r>
+              <w:rPr>
+                <w:sz w:val="16"/>
+              </w:rPr>
+              <w:t>Deterministic comparison of a calculated value against a configured threshold. Each flag carries id, severity, metric, current value, threshold, rule text, action and evidence.</w:t>
+            </w:r>
+          </w:p>
+        </w:tc>
+        <w:tc>
+          <w:tcPr>
+            <w:tcW w:type="dxa" w:w="2160"/>
+          </w:tcPr>
+          <w:p>
+            <w:r>
+              <w:rPr>
+                <w:sz w:val="16"/>
+              </w:rPr>
+              <w:t>Severity ladder: CRITICAL &gt; HIGH &gt; WARNING &gt; MONITOR &gt; INFO. HIGH means the number breaches a planning standard; MONITOR means watch it; INFO is context.</w:t>
+            </w:r>
+          </w:p>
+        </w:tc>
+        <w:tc>
+          <w:tcPr>
+            <w:tcW w:type="dxa" w:w="2160"/>
+          </w:tcPr>
+          <w:p>
+            <w:r>
+              <w:rPr>
+                <w:sz w:val="16"/>
+              </w:rPr>
+              <w:t>A flag is a threshold breach, not a forecast. No AI or judgement is involved, and no flag fires without a configured rule.</w:t>
+            </w:r>
+          </w:p>
+        </w:tc>
+      </w:tr>
+      <w:tr>
+        <w:tc>
+          <w:tcPr>
+            <w:tcW w:type="dxa" w:w="2160"/>
+          </w:tcPr>
+          <w:p>
+            <w:r>
+              <w:rPr>
+                <w:sz w:val="16"/>
+              </w:rPr>
+              <w:t>Severity ladder</w:t>
+            </w:r>
+          </w:p>
+        </w:tc>
+        <w:tc>
+          <w:tcPr>
+            <w:tcW w:type="dxa" w:w="2160"/>
+          </w:tcPr>
+          <w:p>
+            <w:r>
+              <w:rPr>
+                <w:sz w:val="16"/>
+              </w:rPr>
+              <w:t>CRITICAL, HIGH, WARNING, MONITOR, INFO (rules/rule_engine.py SEVERITY_ORDER).</w:t>
+            </w:r>
+          </w:p>
+        </w:tc>
+        <w:tc>
+          <w:tcPr>
+            <w:tcW w:type="dxa" w:w="2160"/>
+          </w:tcPr>
+          <w:p>
+            <w:r>
+              <w:rPr>
+                <w:sz w:val="16"/>
+              </w:rPr>
+              <w:t>HIGH = a configured planning standard is breached (position cap, reserve funding, tail loss, model disagreement). WARNING = a band or limit is out of tolerance. MONITOR = a data or governance weakness. INFO = context.</w:t>
+            </w:r>
+          </w:p>
+        </w:tc>
+        <w:tc>
+          <w:tcPr>
+            <w:tcW w:type="dxa" w:w="2160"/>
+          </w:tcPr>
+          <w:p>
+            <w:r>
+              <w:rPr>
+                <w:sz w:val="16"/>
+              </w:rPr>
+              <w:t>Severity is about the rule, not about the size of the loss.</w:t>
+            </w:r>
+          </w:p>
+        </w:tc>
+      </w:tr>
+      <w:tr>
+        <w:tc>
+          <w:tcPr>
+            <w:tcW w:type="dxa" w:w="2160"/>
+          </w:tcPr>
+          <w:p>
+            <w:r>
+              <w:rPr>
+                <w:sz w:val="16"/>
+              </w:rPr>
+              <w:t>Estimate confidence (High / Medium / Low)</w:t>
+            </w:r>
+          </w:p>
+        </w:tc>
+        <w:tc>
+          <w:tcPr>
+            <w:tcW w:type="dxa" w:w="2160"/>
+          </w:tcPr>
+          <w:p>
+            <w:r>
+              <w:rPr>
+                <w:sz w:val="16"/>
+              </w:rPr>
+              <w:t>High if &gt;=10 years of monthly history, Medium if &gt;=2, Low otherwise.</w:t>
+            </w:r>
+          </w:p>
+        </w:tc>
+        <w:tc>
+          <w:tcPr>
+            <w:tcW w:type="dxa" w:w="2160"/>
+          </w:tcPr>
+          <w:p>
+            <w:r>
+              <w:rPr>
+                <w:sz w:val="16"/>
+              </w:rPr>
+              <w:t>A Low-confidence holding contributes numbers that look precise but are not. Its simulation weight is built on a guess.</w:t>
+            </w:r>
+          </w:p>
+        </w:tc>
+        <w:tc>
+          <w:tcPr>
+            <w:tcW w:type="dxa" w:w="2160"/>
+          </w:tcPr>
+          <w:p>
+            <w:r>
+              <w:rPr>
+                <w:sz w:val="16"/>
+              </w:rPr>
+              <w:t>History length is not the same as stability: 25 years of a regime that has since ended is still misleading.</w:t>
+            </w:r>
+          </w:p>
+        </w:tc>
+      </w:tr>
+      <w:tr>
+        <w:tc>
+          <w:tcPr>
+            <w:tcW w:type="dxa" w:w="2160"/>
+          </w:tcPr>
+          <w:p>
+            <w:r>
+              <w:rPr>
+                <w:sz w:val="16"/>
+              </w:rPr>
+              <w:t>Data provenance (source / as-of)</w:t>
+            </w:r>
+          </w:p>
+        </w:tc>
+        <w:tc>
+          <w:tcPr>
+            <w:tcW w:type="dxa" w:w="2160"/>
+          </w:tcPr>
+          <w:p>
+            <w:r>
+              <w:rPr>
+                <w:sz w:val="16"/>
+              </w:rPr>
+              <w:t>Per ticker: cache hit, network download, or committed bundled snapshot, with rows, inception date and data-as-of date.</w:t>
+            </w:r>
+          </w:p>
+        </w:tc>
+        <w:tc>
+          <w:tcPr>
+            <w:tcW w:type="dxa" w:w="2160"/>
+          </w:tcPr>
+          <w:p>
+            <w:r>
+              <w:rPr>
+                <w:sz w:val="16"/>
+              </w:rPr>
+              <w:t>Two runs with different provenance can differ. 'bundled snapshot' means the analysis used the committed offline dataset, not live prices.</w:t>
+            </w:r>
+          </w:p>
+        </w:tc>
+        <w:tc>
+          <w:tcPr>
+            <w:tcW w:type="dxa" w:w="2160"/>
+          </w:tcPr>
+          <w:p>
+            <w:r>
+              <w:rPr>
+                <w:sz w:val="16"/>
+              </w:rPr>
+              <w:t>Offline reproducibility and live freshness are different goals; the report states which one it used.</w:t>
+            </w:r>
+          </w:p>
+        </w:tc>
+      </w:tr>
+      <w:tr>
+        <w:tc>
+          <w:tcPr>
+            <w:tcW w:type="dxa" w:w="2160"/>
+          </w:tcPr>
+          <w:p>
+            <w:r>
+              <w:rPr>
+                <w:sz w:val="16"/>
+              </w:rPr>
+              <w:t>Return basis (adjusted close)</w:t>
+            </w:r>
+          </w:p>
+        </w:tc>
+        <w:tc>
+          <w:tcPr>
+            <w:tcW w:type="dxa" w:w="2160"/>
+          </w:tcPr>
+          <w:p>
+            <w:r>
+              <w:rPr>
+                <w:sz w:val="16"/>
+              </w:rPr>
+              <w:t>All prices are dividend- and split-adjusted closes, i.e. total-return series.</w:t>
+            </w:r>
+          </w:p>
+        </w:tc>
+        <w:tc>
+          <w:tcPr>
+            <w:tcW w:type="dxa" w:w="2160"/>
+          </w:tcPr>
+          <w:p>
+            <w:r>
+              <w:rPr>
+                <w:sz w:val="16"/>
+              </w:rPr>
+              <w:t>For bond ETFs and dividend payers this materially raises measured return versus raw price.</w:t>
+            </w:r>
+          </w:p>
+        </w:tc>
+        <w:tc>
+          <w:tcPr>
+            <w:tcW w:type="dxa" w:w="2160"/>
+          </w:tcPr>
+          <w:p>
+            <w:r>
+              <w:rPr>
+                <w:sz w:val="16"/>
+              </w:rPr>
+              <w:t>Comparing these results to a price-index chart will make the model look too optimistic.</w:t>
+            </w:r>
+          </w:p>
+        </w:tc>
+      </w:tr>
+      <w:tr>
+        <w:tc>
+          <w:tcPr>
+            <w:tcW w:type="dxa" w:w="2160"/>
+          </w:tcPr>
+          <w:p>
+            <w:r>
+              <w:rPr>
+                <w:sz w:val="16"/>
+              </w:rPr>
+              <w:t>Survivorship bias</w:t>
+            </w:r>
+          </w:p>
+        </w:tc>
+        <w:tc>
+          <w:tcPr>
+            <w:tcW w:type="dxa" w:w="2160"/>
+          </w:tcPr>
+          <w:p>
+            <w:r>
+              <w:rPr>
+                <w:sz w:val="16"/>
+              </w:rPr>
+              <w:t>Historical series only contain securities that still exist.</w:t>
+            </w:r>
+          </w:p>
+        </w:tc>
+        <w:tc>
+          <w:tcPr>
+            <w:tcW w:type="dxa" w:w="2160"/>
+          </w:tcPr>
+          <w:p>
+            <w:r>
+              <w:rPr>
+                <w:sz w:val="16"/>
+              </w:rPr>
+              <w:t>Every historical return figure here is mildly flattering.</w:t>
+            </w:r>
+          </w:p>
+        </w:tc>
+        <w:tc>
+          <w:tcPr>
+            <w:tcW w:type="dxa" w:w="2160"/>
+          </w:tcPr>
+          <w:p>
+            <w:r>
+              <w:rPr>
+                <w:sz w:val="16"/>
+              </w:rPr>
+              <w:t>It cannot be corrected by the model; it can only be acknowledged.</w:t>
+            </w:r>
+          </w:p>
+        </w:tc>
+      </w:tr>
+      <w:tr>
+        <w:tc>
+          <w:tcPr>
+            <w:tcW w:type="dxa" w:w="2160"/>
+          </w:tcPr>
+          <w:p>
+            <w:r>
+              <w:rPr>
+                <w:sz w:val="16"/>
+              </w:rPr>
+              <w:t>P&amp;L basis</w:t>
+            </w:r>
+          </w:p>
+        </w:tc>
+        <w:tc>
+          <w:tcPr>
+            <w:tcW w:type="dxa" w:w="2160"/>
+          </w:tcPr>
+          <w:p>
+            <w:r>
+              <w:rPr>
+                <w:sz w:val="16"/>
+              </w:rPr>
+              <w:t>Dollar P&amp;L is computed only when cost basis is supplied; otherwise return-based attribution is used.</w:t>
+            </w:r>
+          </w:p>
+        </w:tc>
+        <w:tc>
+          <w:tcPr>
+            <w:tcW w:type="dxa" w:w="2160"/>
+          </w:tcPr>
+          <w:p>
+            <w:r>
+              <w:rPr>
+                <w:sz w:val="16"/>
+              </w:rPr>
+              <w:t>Without cost basis there are no dollar gains and losses in the report, only percentage returns.</w:t>
+            </w:r>
+          </w:p>
+        </w:tc>
+        <w:tc>
+          <w:tcPr>
+            <w:tcW w:type="dxa" w:w="2160"/>
+          </w:tcPr>
+          <w:p>
+            <w:r>
+              <w:rPr>
+                <w:sz w:val="16"/>
+              </w:rPr>
+              <w:t>The model never invents a cost basis. Missing data is reported as missing.</w:t>
+            </w:r>
+          </w:p>
+        </w:tc>
+      </w:tr>
+      <w:tr>
+        <w:tc>
+          <w:tcPr>
+            <w:tcW w:type="dxa" w:w="2160"/>
+          </w:tcPr>
+          <w:p>
+            <w:r>
+              <w:rPr>
+                <w:sz w:val="16"/>
+              </w:rPr>
+              <w:t>Taxes</w:t>
+            </w:r>
+          </w:p>
+        </w:tc>
+        <w:tc>
+          <w:tcPr>
+            <w:tcW w:type="dxa" w:w="2160"/>
+          </w:tcPr>
+          <w:p>
+            <w:r>
+              <w:rPr>
+                <w:sz w:val="16"/>
+              </w:rPr>
+              <w:t>Excluded unless tax-lot information is supplied.</w:t>
+            </w:r>
+          </w:p>
+        </w:tc>
+        <w:tc>
+          <w:tcPr>
+            <w:tcW w:type="dxa" w:w="2160"/>
+          </w:tcPr>
+          <w:p>
+            <w:r>
+              <w:rPr>
+                <w:sz w:val="16"/>
+              </w:rPr>
+              <w:t>Rebalancing suggestions ignore tax cost, so a 'trim the winner' recommendation is more expensive in reality than in the model.</w:t>
+            </w:r>
+          </w:p>
+        </w:tc>
+        <w:tc>
+          <w:tcPr>
+            <w:tcW w:type="dxa" w:w="2160"/>
+          </w:tcPr>
+          <w:p>
+            <w:r>
+              <w:rPr>
+                <w:sz w:val="16"/>
+              </w:rPr>
+              <w:t>Transaction cost is modelled (0.1% of turnover); tax is not modelled at all.</w:t>
+            </w:r>
+          </w:p>
+        </w:tc>
+      </w:tr>
+      <w:tr>
+        <w:tc>
+          <w:tcPr>
+            <w:tcW w:type="dxa" w:w="2160"/>
+          </w:tcPr>
+          <w:p>
+            <w:r>
+              <w:rPr>
+                <w:sz w:val="16"/>
+              </w:rPr>
+              <w:t>Scorecard / overall score</w:t>
+            </w:r>
+          </w:p>
+        </w:tc>
+        <w:tc>
+          <w:tcPr>
+            <w:tcW w:type="dxa" w:w="2160"/>
+          </w:tcPr>
+          <w:p>
+            <w:r>
+              <w:rPr>
+                <w:sz w:val="16"/>
+              </w:rPr>
+              <w:t>Category scores (0-10) for funding, concentration, diversification, data quality and process, combined into an overall score.</w:t>
+            </w:r>
+          </w:p>
+        </w:tc>
+        <w:tc>
+          <w:tcPr>
+            <w:tcW w:type="dxa" w:w="2160"/>
+          </w:tcPr>
+          <w:p>
+            <w:r>
+              <w:rPr>
+                <w:sz w:val="16"/>
+              </w:rPr>
+              <w:t>Use it to find which category to open first. It is deliberately not the conclusion of the report.</w:t>
+            </w:r>
+          </w:p>
+        </w:tc>
+        <w:tc>
+          <w:tcPr>
+            <w:tcW w:type="dxa" w:w="2160"/>
+          </w:tcPr>
+          <w:p>
+            <w:r>
+              <w:rPr>
+                <w:sz w:val="16"/>
+              </w:rPr>
+              <w:t>It is a weighted judgement encoded in code; changing weights changes the score, not the portfolio.</w:t>
+            </w:r>
+          </w:p>
+        </w:tc>
+      </w:tr>
+    </w:tbl>
     <w:sectPr>
       <w:pgSz w:w="12240" w:h="15840"/>
       <w:pgMar w:top="1440" w:right="1800" w:bottom="1440" w:left="1800" w:header="720" w:footer="720" w:gutter="0"/>

</xml_diff>